<commit_message>
EndNote: live citation fields in citation order (first revision)
- Methods refs 8-10 (STROBE, Dekkers 2012, STROBE E&E) converted from plain
  text to EN.CITE fields with embedded records (PubMed-verified)
- DisplayText of all 31 citation fields synced to final numbering 1-28
- Reference list order verified against first-citation order
- references (EndNote XML).xml: all 28 records for import into EndNote

Co-Authored-By: Claude Opus 5.5 <noreply@anthropic.com>
</commit_message>
<xml_diff>
--- a/manuscript revised-2 (highlighted).docx
+++ b/manuscript revised-2 (highlighted).docx
@@ -6485,7 +6485,127 @@
           <w:szCs w:val="20"/>
           <w:highlight w:val="yellow"/>
         </w:rPr>
-        <w:t>The study was designed as a single-center retrospective cohort study and is reported in accordance with the Strengthening the Reporting of Observational Studies in Epidemiology (STROBE) statement [8]. Patients were identified by their exposure, namely elective MICS under one of two predefined intravenous anesthetic techniques, within fixed eligibility criteria and a fixed calendar period, and were then followed through their records for predefined perioperative outcomes; sampling on exposure rather than on outcome defines a cohort rather than a case series, irrespective of cohort size or the presence of a comparison group [9].</w:t>
+        <w:t xml:space="preserve">The study was designed as a single-center retrospective cohort study and is reported in accordance with the Strengthening the Reporting of Observational Studies in Epidemiology (STROBE) statement </w:t>
+      </w:r>
+      <w:r>
+        <w:rPr>
+          <w:rFonts w:ascii="Times New Roman" w:hAnsi="Times New Roman" w:cs="Times New Roman"/>
+          <w:color w:val="000000" w:themeColor="text1"/>
+          <w:sz w:val="20"/>
+          <w:szCs w:val="20"/>
+          <w:highlight w:val="yellow"/>
+        </w:rPr>
+        <w:fldChar w:fldCharType="begin"/>
+      </w:r>
+      <w:r>
+        <w:rPr>
+          <w:rFonts w:ascii="Times New Roman" w:hAnsi="Times New Roman" w:cs="Times New Roman"/>
+          <w:color w:val="000000" w:themeColor="text1"/>
+          <w:sz w:val="20"/>
+          <w:szCs w:val="20"/>
+          <w:highlight w:val="yellow"/>
+        </w:rPr>
+        <w:instrText xml:space="preserve"> ADDIN EN.CITE &lt;EndNote&gt;&lt;Cite&gt;&lt;Author&gt;von Elm&lt;/Author&gt;&lt;Year&gt;2007&lt;/Year&gt;&lt;RecNum&gt;1&lt;/RecNum&gt;&lt;DisplayText&gt;[8]&lt;/DisplayText&gt;&lt;record&gt;&lt;rec-number&gt;1&lt;/rec-number&gt;&lt;foreign-keys&gt;&lt;key app="EN" db-id="pr26strobe0cohort0refs0x9k2m4q7t1v3" timestamp="1793232000"&gt;1&lt;/key&gt;&lt;/foreign-keys&gt;&lt;ref-type name="Journal Article"&gt;17&lt;/ref-type&gt;&lt;contributors&gt;&lt;authors&gt;&lt;author&gt;von Elm, E.&lt;/author&gt;&lt;author&gt;Altman, D. G.&lt;/author&gt;&lt;author&gt;Egger, M.&lt;/author&gt;&lt;author&gt;Pocock, S. J.&lt;/author&gt;&lt;author&gt;Gøtzsche, P. C.&lt;/author&gt;&lt;author&gt;Vandenbroucke, J. P.&lt;/author&gt;&lt;/authors&gt;&lt;/contributors&gt;&lt;titles&gt;&lt;title&gt;The Strengthening the Reporting of Observational Studies in Epidemiology (STROBE) statement: guidelines for reporting observational studies&lt;/title&gt;&lt;secondary-title&gt;Lancet&lt;/secondary-title&gt;&lt;/titles&gt;&lt;periodical&gt;&lt;full-title&gt;Lancet&lt;/full-title&gt;&lt;/periodical&gt;&lt;pages&gt;1453-7&lt;/pages&gt;&lt;volume&gt;370&lt;/volume&gt;&lt;number&gt;9596&lt;/number&gt;&lt;dates&gt;&lt;year&gt;2007&lt;/year&gt;&lt;pub-dates&gt;&lt;date&gt;Oct 20&lt;/date&gt;&lt;/pub-dates&gt;&lt;/dates&gt;&lt;accession-num&gt;18064739&lt;/accession-num&gt;&lt;urls&gt;&lt;/urls&gt;&lt;electronic-resource-num&gt;10.1016/S0140-6736(07)61602-X&lt;/electronic-resource-num&gt;&lt;remote-database-provider&gt;NLM&lt;/remote-database-provider&gt;&lt;language&gt;eng&lt;/language&gt;&lt;/record&gt;&lt;/Cite&gt;&lt;/EndNote&gt; </w:instrText>
+      </w:r>
+      <w:r>
+        <w:rPr>
+          <w:rFonts w:ascii="Times New Roman" w:hAnsi="Times New Roman" w:cs="Times New Roman"/>
+          <w:color w:val="000000" w:themeColor="text1"/>
+          <w:sz w:val="20"/>
+          <w:szCs w:val="20"/>
+          <w:highlight w:val="yellow"/>
+        </w:rPr>
+        <w:fldChar w:fldCharType="separate"/>
+      </w:r>
+      <w:r>
+        <w:rPr>
+          <w:rFonts w:ascii="Times New Roman" w:hAnsi="Times New Roman" w:cs="Times New Roman"/>
+          <w:color w:val="000000" w:themeColor="text1"/>
+          <w:sz w:val="20"/>
+          <w:szCs w:val="20"/>
+          <w:highlight w:val="yellow"/>
+        </w:rPr>
+        <w:t>[8]</w:t>
+      </w:r>
+      <w:r>
+        <w:rPr>
+          <w:rFonts w:ascii="Times New Roman" w:hAnsi="Times New Roman" w:cs="Times New Roman"/>
+          <w:color w:val="000000" w:themeColor="text1"/>
+          <w:sz w:val="20"/>
+          <w:szCs w:val="20"/>
+          <w:highlight w:val="yellow"/>
+        </w:rPr>
+        <w:fldChar w:fldCharType="end"/>
+      </w:r>
+      <w:r>
+        <w:rPr>
+          <w:rFonts w:ascii="Times New Roman" w:hAnsi="Times New Roman" w:cs="Times New Roman"/>
+          <w:color w:val="000000" w:themeColor="text1"/>
+          <w:sz w:val="20"/>
+          <w:szCs w:val="20"/>
+          <w:highlight w:val="yellow"/>
+        </w:rPr>
+        <w:t xml:space="preserve">. Patients were identified by their exposure, namely elective MICS under one of two predefined intravenous anesthetic techniques, within fixed eligibility criteria and a fixed calendar period, and were then followed through their records for predefined perioperative outcomes; sampling on exposure rather than on outcome defines a cohort rather than a case series, irrespective of cohort size or the presence of a comparison group </w:t>
+      </w:r>
+      <w:r>
+        <w:rPr>
+          <w:rFonts w:ascii="Times New Roman" w:hAnsi="Times New Roman" w:cs="Times New Roman"/>
+          <w:color w:val="000000" w:themeColor="text1"/>
+          <w:sz w:val="20"/>
+          <w:szCs w:val="20"/>
+          <w:highlight w:val="yellow"/>
+        </w:rPr>
+        <w:fldChar w:fldCharType="begin"/>
+      </w:r>
+      <w:r>
+        <w:rPr>
+          <w:rFonts w:ascii="Times New Roman" w:hAnsi="Times New Roman" w:cs="Times New Roman"/>
+          <w:color w:val="000000" w:themeColor="text1"/>
+          <w:sz w:val="20"/>
+          <w:szCs w:val="20"/>
+          <w:highlight w:val="yellow"/>
+        </w:rPr>
+        <w:instrText xml:space="preserve"> ADDIN EN.CITE &lt;EndNote&gt;&lt;Cite&gt;&lt;Author&gt;Dekkers&lt;/Author&gt;&lt;Year&gt;2012&lt;/Year&gt;&lt;RecNum&gt;2&lt;/RecNum&gt;&lt;DisplayText&gt;[9]&lt;/DisplayText&gt;&lt;record&gt;&lt;rec-number&gt;2&lt;/rec-number&gt;&lt;foreign-keys&gt;&lt;key app="EN" db-id="pr26strobe0cohort0refs0x9k2m4q7t1v3" timestamp="1793232000"&gt;2&lt;/key&gt;&lt;/foreign-keys&gt;&lt;ref-type name="Journal Article"&gt;17&lt;/ref-type&gt;&lt;contributors&gt;&lt;authors&gt;&lt;author&gt;Dekkers, O. M.&lt;/author&gt;&lt;author&gt;Egger, M.&lt;/author&gt;&lt;author&gt;Altman, D. G.&lt;/author&gt;&lt;author&gt;Vandenbroucke, J. P.&lt;/author&gt;&lt;/authors&gt;&lt;/contributors&gt;&lt;titles&gt;&lt;title&gt;Distinguishing case series from cohort studies&lt;/title&gt;&lt;secondary-title&gt;Ann Intern Med&lt;/secondary-title&gt;&lt;/titles&gt;&lt;periodical&gt;&lt;full-title&gt;Ann Intern Med&lt;/full-title&gt;&lt;/periodical&gt;&lt;pages&gt;37-40&lt;/pages&gt;&lt;volume&gt;156&lt;/volume&gt;&lt;number&gt;1 Pt 1&lt;/number&gt;&lt;dates&gt;&lt;year&gt;2012&lt;/year&gt;&lt;pub-dates&gt;&lt;date&gt;Jan 3&lt;/date&gt;&lt;/pub-dates&gt;&lt;/dates&gt;&lt;accession-num&gt;22213493&lt;/accession-num&gt;&lt;urls&gt;&lt;/urls&gt;&lt;electronic-resource-num&gt;10.7326/0003-4819-156-1-201201030-00006&lt;/electronic-resource-num&gt;&lt;remote-database-provider&gt;NLM&lt;/remote-database-provider&gt;&lt;language&gt;eng&lt;/language&gt;&lt;/record&gt;&lt;/Cite&gt;&lt;/EndNote&gt; </w:instrText>
+      </w:r>
+      <w:r>
+        <w:rPr>
+          <w:rFonts w:ascii="Times New Roman" w:hAnsi="Times New Roman" w:cs="Times New Roman"/>
+          <w:color w:val="000000" w:themeColor="text1"/>
+          <w:sz w:val="20"/>
+          <w:szCs w:val="20"/>
+          <w:highlight w:val="yellow"/>
+        </w:rPr>
+        <w:fldChar w:fldCharType="separate"/>
+      </w:r>
+      <w:r>
+        <w:rPr>
+          <w:rFonts w:ascii="Times New Roman" w:hAnsi="Times New Roman" w:cs="Times New Roman"/>
+          <w:color w:val="000000" w:themeColor="text1"/>
+          <w:sz w:val="20"/>
+          <w:szCs w:val="20"/>
+          <w:highlight w:val="yellow"/>
+        </w:rPr>
+        <w:t>[9]</w:t>
+      </w:r>
+      <w:r>
+        <w:rPr>
+          <w:rFonts w:ascii="Times New Roman" w:hAnsi="Times New Roman" w:cs="Times New Roman"/>
+          <w:color w:val="000000" w:themeColor="text1"/>
+          <w:sz w:val="20"/>
+          <w:szCs w:val="20"/>
+          <w:highlight w:val="yellow"/>
+        </w:rPr>
+        <w:fldChar w:fldCharType="end"/>
+      </w:r>
+      <w:r>
+        <w:rPr>
+          <w:rFonts w:ascii="Times New Roman" w:hAnsi="Times New Roman" w:cs="Times New Roman"/>
+          <w:color w:val="000000" w:themeColor="text1"/>
+          <w:sz w:val="20"/>
+          <w:szCs w:val="20"/>
+          <w:highlight w:val="yellow"/>
+        </w:rPr>
+        <w:t xml:space="preserve">.</w:t>
       </w:r>
       <w:proofErr w:type="spellEnd"/>
       <w:proofErr w:type="spellStart"/>
@@ -12227,7 +12347,67 @@
           <w:szCs w:val="20"/>
           <w:highlight w:val="yellow"/>
         </w:rPr>
-        <w:t>The study size was determined by the total number of eligible patients treated at our institution during the study period, not by an a priori calculation. Because the objective was descriptive and no hypothesis was tested, a formal power calculation was not applicable. In line with the STROBE recommendations, no post hoc power calculation was performed; the precision of the estimates is instead conveyed by 95% CIs [8, 10].</w:t>
+        <w:t xml:space="preserve">The study size was determined by the total number of eligible patients treated at our institution during the study period, not by an a priori calculation. Because the objective was descriptive and no hypothesis was tested, a formal power calculation was not applicable. In line with the STROBE recommendations, no post hoc power calculation was performed; the precision of the estimates is instead conveyed by 95% CIs </w:t>
+      </w:r>
+      <w:r>
+        <w:rPr>
+          <w:rFonts w:ascii="Times New Roman" w:hAnsi="Times New Roman" w:cs="Times New Roman"/>
+          <w:color w:val="000000" w:themeColor="text1"/>
+          <w:sz w:val="20"/>
+          <w:szCs w:val="20"/>
+          <w:highlight w:val="yellow"/>
+        </w:rPr>
+        <w:fldChar w:fldCharType="begin"/>
+      </w:r>
+      <w:r>
+        <w:rPr>
+          <w:rFonts w:ascii="Times New Roman" w:hAnsi="Times New Roman" w:cs="Times New Roman"/>
+          <w:color w:val="000000" w:themeColor="text1"/>
+          <w:sz w:val="20"/>
+          <w:szCs w:val="20"/>
+          <w:highlight w:val="yellow"/>
+        </w:rPr>
+        <w:instrText xml:space="preserve"> ADDIN EN.CITE &lt;EndNote&gt;&lt;Cite&gt;&lt;Author&gt;von Elm&lt;/Author&gt;&lt;Year&gt;2007&lt;/Year&gt;&lt;RecNum&gt;1&lt;/RecNum&gt;&lt;DisplayText&gt;[8, 10]&lt;/DisplayText&gt;&lt;record&gt;&lt;rec-number&gt;1&lt;/rec-number&gt;&lt;foreign-keys&gt;&lt;key app="EN" db-id="pr26strobe0cohort0refs0x9k2m4q7t1v3" timestamp="1793232000"&gt;1&lt;/key&gt;&lt;/foreign-keys&gt;&lt;ref-type name="Journal Article"&gt;17&lt;/ref-type&gt;&lt;contributors&gt;&lt;authors&gt;&lt;author&gt;von Elm, E.&lt;/author&gt;&lt;author&gt;Altman, D. G.&lt;/author&gt;&lt;author&gt;Egger, M.&lt;/author&gt;&lt;author&gt;Pocock, S. J.&lt;/author&gt;&lt;author&gt;Gøtzsche, P. C.&lt;/author&gt;&lt;author&gt;Vandenbroucke, J. P.&lt;/author&gt;&lt;/authors&gt;&lt;/contributors&gt;&lt;titles&gt;&lt;title&gt;The Strengthening the Reporting of Observational Studies in Epidemiology (STROBE) statement: guidelines for reporting observational studies&lt;/title&gt;&lt;secondary-title&gt;Lancet&lt;/secondary-title&gt;&lt;/titles&gt;&lt;periodical&gt;&lt;full-title&gt;Lancet&lt;/full-title&gt;&lt;/periodical&gt;&lt;pages&gt;1453-7&lt;/pages&gt;&lt;volume&gt;370&lt;/volume&gt;&lt;number&gt;9596&lt;/number&gt;&lt;dates&gt;&lt;year&gt;2007&lt;/year&gt;&lt;pub-dates&gt;&lt;date&gt;Oct 20&lt;/date&gt;&lt;/pub-dates&gt;&lt;/dates&gt;&lt;accession-num&gt;18064739&lt;/accession-num&gt;&lt;urls&gt;&lt;/urls&gt;&lt;electronic-resource-num&gt;10.1016/S0140-6736(07)61602-X&lt;/electronic-resource-num&gt;&lt;remote-database-provider&gt;NLM&lt;/remote-database-provider&gt;&lt;language&gt;eng&lt;/language&gt;&lt;/record&gt;&lt;/Cite&gt;&lt;Cite&gt;&lt;Author&gt;Vandenbroucke&lt;/Author&gt;&lt;Year&gt;2007&lt;/Year&gt;&lt;RecNum&gt;3&lt;/RecNum&gt;&lt;record&gt;&lt;rec-number&gt;3&lt;/rec-number&gt;&lt;foreign-keys&gt;&lt;key app="EN" db-id="pr26strobe0cohort0refs0x9k2m4q7t1v3" timestamp="1793232000"&gt;3&lt;/key&gt;&lt;/foreign-keys&gt;&lt;ref-type name="Journal Article"&gt;17&lt;/ref-type&gt;&lt;contributors&gt;&lt;authors&gt;&lt;author&gt;Vandenbroucke, J. P.&lt;/author&gt;&lt;author&gt;von Elm, E.&lt;/author&gt;&lt;author&gt;Altman, D. G.&lt;/author&gt;&lt;author&gt;Gøtzsche, P. C.&lt;/author&gt;&lt;author&gt;Mulrow, C. D.&lt;/author&gt;&lt;author&gt;Pocock, S. J.&lt;/author&gt;&lt;author&gt;Poole, C.&lt;/author&gt;&lt;author&gt;Schlesselman, J. J.&lt;/author&gt;&lt;author&gt;Egger, M.&lt;/author&gt;&lt;/authors&gt;&lt;/contributors&gt;&lt;titles&gt;&lt;title&gt;Strengthening the Reporting of Observational Studies in Epidemiology (STROBE): explanation and elaboration&lt;/title&gt;&lt;secondary-title&gt;PLoS Med&lt;/secondary-title&gt;&lt;/titles&gt;&lt;periodical&gt;&lt;full-title&gt;PLoS Med&lt;/full-title&gt;&lt;/periodical&gt;&lt;pages&gt;e297&lt;/pages&gt;&lt;volume&gt;4&lt;/volume&gt;&lt;number&gt;10&lt;/number&gt;&lt;dates&gt;&lt;year&gt;2007&lt;/year&gt;&lt;pub-dates&gt;&lt;date&gt;Oct 16&lt;/date&gt;&lt;/pub-dates&gt;&lt;/dates&gt;&lt;accession-num&gt;17941715&lt;/accession-num&gt;&lt;urls&gt;&lt;/urls&gt;&lt;electronic-resource-num&gt;10.1371/journal.pmed.0040297&lt;/electronic-resource-num&gt;&lt;remote-database-provider&gt;NLM&lt;/remote-database-provider&gt;&lt;language&gt;eng&lt;/language&gt;&lt;/record&gt;&lt;/Cite&gt;&lt;/EndNote&gt; </w:instrText>
+      </w:r>
+      <w:r>
+        <w:rPr>
+          <w:rFonts w:ascii="Times New Roman" w:hAnsi="Times New Roman" w:cs="Times New Roman"/>
+          <w:color w:val="000000" w:themeColor="text1"/>
+          <w:sz w:val="20"/>
+          <w:szCs w:val="20"/>
+          <w:highlight w:val="yellow"/>
+        </w:rPr>
+        <w:fldChar w:fldCharType="separate"/>
+      </w:r>
+      <w:r>
+        <w:rPr>
+          <w:rFonts w:ascii="Times New Roman" w:hAnsi="Times New Roman" w:cs="Times New Roman"/>
+          <w:color w:val="000000" w:themeColor="text1"/>
+          <w:sz w:val="20"/>
+          <w:szCs w:val="20"/>
+          <w:highlight w:val="yellow"/>
+        </w:rPr>
+        <w:t>[8, 10]</w:t>
+      </w:r>
+      <w:r>
+        <w:rPr>
+          <w:rFonts w:ascii="Times New Roman" w:hAnsi="Times New Roman" w:cs="Times New Roman"/>
+          <w:color w:val="000000" w:themeColor="text1"/>
+          <w:sz w:val="20"/>
+          <w:szCs w:val="20"/>
+          <w:highlight w:val="yellow"/>
+        </w:rPr>
+        <w:fldChar w:fldCharType="end"/>
+      </w:r>
+      <w:r>
+        <w:rPr>
+          <w:rFonts w:ascii="Times New Roman" w:hAnsi="Times New Roman" w:cs="Times New Roman"/>
+          <w:color w:val="000000" w:themeColor="text1"/>
+          <w:sz w:val="20"/>
+          <w:szCs w:val="20"/>
+          <w:highlight w:val="yellow"/>
+        </w:rPr>
+        <w:t xml:space="preserve">.</w:t>
       </w:r>
     </w:p>
     <w:p>
@@ -17617,7 +17797,7 @@
           <w:sz w:val="20"/>
           <w:szCs w:val="20"/>
         </w:rPr>
-        <w:instrText xml:space="preserve"> ADDIN EN.CITE &lt;EndNote&gt;&lt;Cite&gt;&lt;Author&gt;White&lt;/Author&gt;&lt;Year&gt;2021&lt;/Year&gt;&lt;RecNum&gt;16&lt;/RecNum&gt;&lt;DisplayText&gt;[8]&lt;/DisplayText&gt;&lt;record&gt;&lt;rec-number&gt;16&lt;/rec-number&gt;&lt;foreign-keys&gt;&lt;key app="EN" db-id="sspsadtz5rexd3efdx2xftzep5a0tszvrest" timestamp="1787938225"&gt;16&lt;/key&gt;&lt;/foreign-keys&gt;&lt;ref-type name="Journal Article"&gt;17&lt;/ref-type&gt;&lt;contributors&gt;&lt;authors&gt;&lt;author&gt;White, A.&lt;/author&gt;&lt;author&gt;Patvardhan, C.&lt;/author&gt;&lt;author&gt;Falter, F.&lt;/author&gt;&lt;/authors&gt;&lt;/contributors&gt;&lt;auth-address&gt;Senior Fellow in Anaesthetics and Intensive Care, The Royal Papworth Hospital NHS Foundation Trust, Cambridge, UK.&amp;#xD;Consultant in Anaesthetics and Intensive Care, The Royal Papworth Hospital NHS Foundation Trust, Cambridge, UK.&lt;/auth-address&gt;&lt;titles&gt;&lt;title&gt;Anesthesia for minimally invasive cardiac surgery&lt;/title&gt;&lt;secondary-title&gt;J Thorac Dis&lt;/secondary-title&gt;&lt;/titles&gt;&lt;periodical&gt;&lt;full-title&gt;J Thorac Dis&lt;/full-title&gt;&lt;/periodical&gt;&lt;pages&gt;1886-1898&lt;/pages&gt;&lt;volume&gt;13&lt;/volume&gt;&lt;number&gt;3&lt;/number&gt;&lt;keywords&gt;&lt;keyword&gt;Minimal invasive cardiac surgery (MICS)&lt;/keyword&gt;&lt;keyword&gt;anesthesia&lt;/keyword&gt;&lt;keyword&gt;regional anesthesia&lt;/keyword&gt;&lt;keyword&gt;transesophageal echocardiography (TEE)&lt;/keyword&gt;&lt;/keywords&gt;&lt;dates&gt;&lt;year&gt;2021&lt;/year&gt;&lt;pub-dates&gt;&lt;date&gt;Mar&lt;/date&gt;&lt;/pub-dates&gt;&lt;/dates&gt;&lt;isbn&gt;2072-1439 (Print)&amp;#xD;2072-1439&lt;/isbn&gt;&lt;accession-num&gt;33841977&lt;/accession-num&gt;&lt;urls&gt;&lt;/urls&gt;&lt;custom1&gt;Conflicts of Interest: All authors have completed the ICMJE uniform disclosure form (available at http://dx.doi.org/10.21037/jtd-20-1804). The series “Minimally Invasive Cardiac Surgery” was commissioned by the editorial office without any funding or sponsorship. The authors have no other conflicts of interest to declare.&lt;/custom1&gt;&lt;custom2&gt;PMC8024802&lt;/custom2&gt;&lt;electronic-resource-num&gt;10.21037/jtd-20-1804&lt;/electronic-resource-num&gt;&lt;remote-database-provider&gt;NLM&lt;/remote-database-provider&gt;&lt;language&gt;eng&lt;/language&gt;&lt;/record&gt;&lt;/Cite&gt;&lt;/EndNote&gt;</w:instrText>
+        <w:instrText xml:space="preserve"> ADDIN EN.CITE &lt;EndNote&gt;&lt;Cite&gt;&lt;Author&gt;White&lt;/Author&gt;&lt;Year&gt;2021&lt;/Year&gt;&lt;RecNum&gt;16&lt;/RecNum&gt;&lt;DisplayText&gt;[11]&lt;/DisplayText&gt;&lt;record&gt;&lt;rec-number&gt;16&lt;/rec-number&gt;&lt;foreign-keys&gt;&lt;key app="EN" db-id="sspsadtz5rexd3efdx2xftzep5a0tszvrest" timestamp="1787938225"&gt;16&lt;/key&gt;&lt;/foreign-keys&gt;&lt;ref-type name="Journal Article"&gt;17&lt;/ref-type&gt;&lt;contributors&gt;&lt;authors&gt;&lt;author&gt;White, A.&lt;/author&gt;&lt;author&gt;Patvardhan, C.&lt;/author&gt;&lt;author&gt;Falter, F.&lt;/author&gt;&lt;/authors&gt;&lt;/contributors&gt;&lt;auth-address&gt;Senior Fellow in Anaesthetics and Intensive Care, The Royal Papworth Hospital NHS Foundation Trust, Cambridge, UK.&amp;#xD;Consultant in Anaesthetics and Intensive Care, The Royal Papworth Hospital NHS Foundation Trust, Cambridge, UK.&lt;/auth-address&gt;&lt;titles&gt;&lt;title&gt;Anesthesia for minimally invasive cardiac surgery&lt;/title&gt;&lt;secondary-title&gt;J Thorac Dis&lt;/secondary-title&gt;&lt;/titles&gt;&lt;periodical&gt;&lt;full-title&gt;J Thorac Dis&lt;/full-title&gt;&lt;/periodical&gt;&lt;pages&gt;1886-1898&lt;/pages&gt;&lt;volume&gt;13&lt;/volume&gt;&lt;number&gt;3&lt;/number&gt;&lt;keywords&gt;&lt;keyword&gt;Minimal invasive cardiac surgery (MICS)&lt;/keyword&gt;&lt;keyword&gt;anesthesia&lt;/keyword&gt;&lt;keyword&gt;regional anesthesia&lt;/keyword&gt;&lt;keyword&gt;transesophageal echocardiography (TEE)&lt;/keyword&gt;&lt;/keywords&gt;&lt;dates&gt;&lt;year&gt;2021&lt;/year&gt;&lt;pub-dates&gt;&lt;date&gt;Mar&lt;/date&gt;&lt;/pub-dates&gt;&lt;/dates&gt;&lt;isbn&gt;2072-1439 (Print)&amp;#xD;2072-1439&lt;/isbn&gt;&lt;accession-num&gt;33841977&lt;/accession-num&gt;&lt;urls&gt;&lt;/urls&gt;&lt;custom1&gt;Conflicts of Interest: All authors have completed the ICMJE uniform disclosure form (available at http://dx.doi.org/10.21037/jtd-20-1804). The series “Minimally Invasive Cardiac Surgery” was commissioned by the editorial office without any funding or sponsorship. The authors have no other conflicts of interest to declare.&lt;/custom1&gt;&lt;custom2&gt;PMC8024802&lt;/custom2&gt;&lt;electronic-resource-num&gt;10.21037/jtd-20-1804&lt;/electronic-resource-num&gt;&lt;remote-database-provider&gt;NLM&lt;/remote-database-provider&gt;&lt;language&gt;eng&lt;/language&gt;&lt;/record&gt;&lt;/Cite&gt;&lt;/EndNote&gt; </w:instrText>
       </w:r>
       <w:r>
         <w:rPr>
@@ -18033,7 +18213,7 @@
           <w:sz w:val="20"/>
           <w:szCs w:val="20"/>
         </w:rPr>
-        <w:instrText xml:space="preserve"> ADDIN EN.CITE &lt;EndNote&gt;&lt;Cite&gt;&lt;Author&gt;Demir&lt;/Author&gt;&lt;Year&gt;2025&lt;/Year&gt;&lt;RecNum&gt;17&lt;/RecNum&gt;&lt;DisplayText&gt;[9]&lt;/DisplayText&gt;&lt;record&gt;&lt;rec-number&gt;17&lt;/rec-number&gt;&lt;foreign-keys&gt;&lt;key app="EN" db-id="sspsadtz5rexd3efdx2xftzep5a0tszvrest" timestamp="1787938345"&gt;17&lt;/key&gt;&lt;/foreign-keys&gt;&lt;ref-type name="Journal Article"&gt;17&lt;/ref-type&gt;&lt;contributors&gt;&lt;authors&gt;&lt;author&gt;Demir, Zeliha Aslı&lt;/author&gt;&lt;author&gt;Mavioğlu, Hayrettin Levent&lt;/author&gt;&lt;/authors&gt;&lt;/contributors&gt;&lt;titles&gt;&lt;title&gt;Anesthesia Management in Minimally Invasive Cardiac Surgery: A Comprehensive Protocol&lt;/title&gt;&lt;secondary-title&gt;GKD Anest Yoğ Bak Dern Derg&lt;/secondary-title&gt;&lt;/titles&gt;&lt;periodical&gt;&lt;full-title&gt;GKD Anest Yoğ Bak Dern Derg&lt;/full-title&gt;&lt;/periodical&gt;&lt;pages&gt;63-70&lt;/pages&gt;&lt;volume&gt;31&lt;/volume&gt;&lt;number&gt;2&lt;/number&gt;&lt;dates&gt;&lt;year&gt;2025&lt;/year&gt;&lt;/dates&gt;&lt;urls&gt;&lt;related-urls&gt;&lt;url&gt;https://dx.doi.org/10.14744/GKDAD.2025.78790&lt;/url&gt;&lt;/related-urls&gt;&lt;/urls&gt;&lt;electronic-resource-num&gt;10.14744/gkdad.2025.78790&lt;/electronic-resource-num&gt;&lt;/record&gt;&lt;/Cite&gt;&lt;/EndNote&gt;</w:instrText>
+        <w:instrText xml:space="preserve"> ADDIN EN.CITE &lt;EndNote&gt;&lt;Cite&gt;&lt;Author&gt;Demir&lt;/Author&gt;&lt;Year&gt;2025&lt;/Year&gt;&lt;RecNum&gt;17&lt;/RecNum&gt;&lt;DisplayText&gt;[12]&lt;/DisplayText&gt;&lt;record&gt;&lt;rec-number&gt;17&lt;/rec-number&gt;&lt;foreign-keys&gt;&lt;key app="EN" db-id="sspsadtz5rexd3efdx2xftzep5a0tszvrest" timestamp="1787938345"&gt;17&lt;/key&gt;&lt;/foreign-keys&gt;&lt;ref-type name="Journal Article"&gt;17&lt;/ref-type&gt;&lt;contributors&gt;&lt;authors&gt;&lt;author&gt;Demir, Zeliha Aslı&lt;/author&gt;&lt;author&gt;Mavioğlu, Hayrettin Levent&lt;/author&gt;&lt;/authors&gt;&lt;/contributors&gt;&lt;titles&gt;&lt;title&gt;Anesthesia Management in Minimally Invasive Cardiac Surgery: A Comprehensive Protocol&lt;/title&gt;&lt;secondary-title&gt;GKD Anest Yoğ Bak Dern Derg&lt;/secondary-title&gt;&lt;/titles&gt;&lt;periodical&gt;&lt;full-title&gt;GKD Anest Yoğ Bak Dern Derg&lt;/full-title&gt;&lt;/periodical&gt;&lt;pages&gt;63-70&lt;/pages&gt;&lt;volume&gt;31&lt;/volume&gt;&lt;number&gt;2&lt;/number&gt;&lt;dates&gt;&lt;year&gt;2025&lt;/year&gt;&lt;/dates&gt;&lt;urls&gt;&lt;related-urls&gt;&lt;url&gt;https://dx.doi.org/10.14744/GKDAD.2025.78790&lt;/url&gt;&lt;/related-urls&gt;&lt;/urls&gt;&lt;electronic-resource-num&gt;10.14744/gkdad.2025.78790&lt;/electronic-resource-num&gt;&lt;/record&gt;&lt;/Cite&gt;&lt;/EndNote&gt; </w:instrText>
       </w:r>
       <w:r>
         <w:rPr>
@@ -19134,48 +19314,7 @@
           <w:szCs w:val="20"/>
         </w:rPr>
         <w:fldChar w:fldCharType="begin">
-          <w:fldData xml:space="preserve">PEVuZE5vdGU+PENpdGU+PEF1dGhvcj5KaWFuZzwvQXV0aG9yPjxZZWFyPjIwMjQ8L1llYXI+PFJl
-Y051bT4xODwvUmVjTnVtPjxEaXNwbGF5VGV4dD5bMTBdPC9EaXNwbGF5VGV4dD48cmVjb3JkPjxy
-ZWMtbnVtYmVyPjE4PC9yZWMtbnVtYmVyPjxmb3JlaWduLWtleXM+PGtleSBhcHA9IkVOIiBkYi1p
-ZD0ic3Nwc2FkdHo1cmV4ZDNlZmR4MnhmdHplcDVhMHRzenZyZXN0IiB0aW1lc3RhbXA9IjE3ODc5
-Mzg0NzAiPjE4PC9rZXk+PC9mb3JlaWduLWtleXM+PHJlZi10eXBlIG5hbWU9IkpvdXJuYWwgQXJ0
-aWNsZSI+MTc8L3JlZi10eXBlPjxjb250cmlidXRvcnM+PGF1dGhvcnM+PGF1dGhvcj5KaWFuZywg
-VC48L2F1dGhvcj48YXV0aG9yPldhbmcsIEwuIFguPC9hdXRob3I+PGF1dGhvcj5UZW5nLCBILiBL
-LjwvYXV0aG9yPjxhdXRob3I+WHUsIEwuIFQuPC9hdXRob3I+PGF1dGhvcj5Mb3UsIFguIEsuPC9h
-dXRob3I+PGF1dGhvcj5XYW5nLCBZLjwvYXV0aG9yPjxhdXRob3I+V2VpLCBILiBXLjwvYXV0aG9y
-PjxhdXRob3I+WWFuLCBNLiBKLjwvYXV0aG9yPjwvYXV0aG9ycz48L2NvbnRyaWJ1dG9ycz48YXV0
-aC1hZGRyZXNzPlJlaGFiaWxpdGF0aW9uIE1lZGljaW5lIENlbnRlciwgRGVwYXJ0bWVudCBvZiBB
-bmVzdGhlc2lvbG9neSwgWmhlamlhbmcgUHJvdmluY2lhbCBQZW9wbGUmYXBvcztzIEhvc3BpdGFs
-LCBBZmZpbGlhdGVkIFBlb3BsZSZhcG9zO3MgSG9zcGl0YWwsIEhhbmd6aG91IE1lZGljYWwgQ29s
-bGVnZSwgV2FubmFuIE1lZGljYWwgQ29sbGVnZSBHcmFkdWF0ZSBUcmFpbmluZyBCYXNlLCBIYW5n
-emhvdSwgQ2hpbmEuJiN4RDtTY2hvb2wgb2YgR3JhZHVhdGUsIEppbnpob3UgTWVkaWNhbCBVbml2
-ZXJzaXR5LCBKaW56aG91LCBDaGluYS4mI3hEO1JlaGFiaWxpdGF0aW9uIE1lZGljaW5lIENlbnRl
-ciwgRGVwYXJ0bWVudCBvZiBBbmVzdGhlc2lvbG9neSwgWmhlamlhbmcgUHJvdmluY2lhbCBQZW9w
-bGUmYXBvcztzIEhvc3BpdGFsLCBBZmZpbGlhdGVkIFBlb3BsZSZhcG9zO3MgSG9zcGl0YWwsIEhh
-bmd6aG91IE1lZGljYWwgQ29sbGVnZSwgSGFuZ3pob3UsIENoaW5hLjwvYXV0aC1hZGRyZXNzPjx0
-aXRsZXM+PHRpdGxlPlVsdHJhLWZhc3QtdHJhY2sgY2FyZGlhYyBhbmVzdGhlc2lhIGluIG1pbmlt
-YWxseSBpbnZhc2l2ZSBjYXJkaWFjIHN1cmdlcnk6IGEgcmV0cm9zcGVjdGl2ZSBvYnNlcnZhdGlv
-bmFsIHN0dWR5PC90aXRsZT48c2Vjb25kYXJ5LXRpdGxlPkNhcmRpb3Zhc2MgRGlhZ24gVGhlcjwv
-c2Vjb25kYXJ5LXRpdGxlPjwvdGl0bGVzPjxwZXJpb2RpY2FsPjxmdWxsLXRpdGxlPkNhcmRpb3Zh
-c2MgRGlhZ24gVGhlcjwvZnVsbC10aXRsZT48L3BlcmlvZGljYWw+PHBhZ2VzPjc0MC03NTI8L3Bh
-Z2VzPjx2b2x1bWU+MTQ8L3ZvbHVtZT48bnVtYmVyPjU8L251bWJlcj48ZWRpdGlvbj4yMDI0MTAy
-MjwvZWRpdGlvbj48a2V5d29yZHM+PGtleXdvcmQ+QWx2ZW9sYXItYXJ0ZXJpYWwgb3h5Z2VuIHRl
-bnNpb24gZGlmZmVyZW5jZTwva2V5d29yZD48a2V5d29yZD5taW5pbWFsbHkgaW52YXNpdmUgY2Fy
-ZGlhYyBzdXJnZXJ5IChNSUNTKTwva2V5d29yZD48a2V5d29yZD5veHlnZW5hdGlvbiBpbmRleDwv
-a2V5d29yZD48a2V5d29yZD5yZXNwaXJhdG9yeSBpbmRleDwva2V5d29yZD48a2V5d29yZD51bHRy
-YS1mYXN0LXRyYWNrIGNhcmRpYWMgYW5lc3RoZXNpYSAoVUZUQ0EpPC9rZXl3b3JkPjwva2V5d29y
-ZHM+PGRhdGVzPjx5ZWFyPjIwMjQ8L3llYXI+PHB1Yi1kYXRlcz48ZGF0ZT5PY3QgMzE8L2RhdGU+
-PC9wdWItZGF0ZXM+PC9kYXRlcz48aXNibj4yMjIzLTM2NTIgKFByaW50KSYjeEQ7MjIyMy0zNjUy
-PC9pc2JuPjxhY2Nlc3Npb24tbnVtPjM5NTEzMTQ0PC9hY2Nlc3Npb24tbnVtPjx1cmxzPjwvdXJs
-cz48Y3VzdG9tMT5Db25mbGljdHMgb2YgSW50ZXJlc3Q6IEFsbCBhdXRob3JzIGhhdmUgY29tcGxl
-dGVkIHRoZSBJQ01KRSB1bmlmb3JtIGRpc2Nsb3N1cmUgZm9ybSAoYXZhaWxhYmxlIGF0IGh0dHBz
-Oi8vY2R0LmFtZWdyb3Vwcy5jb20vYXJ0aWNsZS92aWV3LzEwLjIxMDM3L2NkdC0yNC0xNzUvY29p
-ZikuIFRoZSBhdXRob3JzIGhhdmUgbm8gY29uZmxpY3RzIG9mIGludGVyZXN0IHRvIGRlY2xhcmUu
-PC9jdXN0b20xPjxjdXN0b20yPlBNQzExNTM4ODMwPC9jdXN0b20yPjxlbGVjdHJvbmljLXJlc291
-cmNlLW51bT4xMC4yMTAzNy9jZHQtMjQtMTc1PC9lbGVjdHJvbmljLXJlc291cmNlLW51bT48cmVt
-b3RlLWRhdGFiYXNlLXByb3ZpZGVyPk5MTTwvcmVtb3RlLWRhdGFiYXNlLXByb3ZpZGVyPjxsYW5n
-dWFnZT5lbmc8L2xhbmd1YWdlPjwvcmVjb3JkPjwvQ2l0ZT48L0VuZE5vdGU+AG==
-</w:fldData>
+          <w:fldData xml:space="preserve">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</w:fldData>
         </w:fldChar>
       </w:r>
       <w:r>
@@ -19195,48 +19334,7 @@
           <w:szCs w:val="20"/>
         </w:rPr>
         <w:fldChar w:fldCharType="begin">
-          <w:fldData xml:space="preserve">PEVuZE5vdGU+PENpdGU+PEF1dGhvcj5KaWFuZzwvQXV0aG9yPjxZZWFyPjIwMjQ8L1llYXI+PFJl
-Y051bT4xODwvUmVjTnVtPjxEaXNwbGF5VGV4dD5bMTBdPC9EaXNwbGF5VGV4dD48cmVjb3JkPjxy
-ZWMtbnVtYmVyPjE4PC9yZWMtbnVtYmVyPjxmb3JlaWduLWtleXM+PGtleSBhcHA9IkVOIiBkYi1p
-ZD0ic3Nwc2FkdHo1cmV4ZDNlZmR4MnhmdHplcDVhMHRzenZyZXN0IiB0aW1lc3RhbXA9IjE3ODc5
-Mzg0NzAiPjE4PC9rZXk+PC9mb3JlaWduLWtleXM+PHJlZi10eXBlIG5hbWU9IkpvdXJuYWwgQXJ0
-aWNsZSI+MTc8L3JlZi10eXBlPjxjb250cmlidXRvcnM+PGF1dGhvcnM+PGF1dGhvcj5KaWFuZywg
-VC48L2F1dGhvcj48YXV0aG9yPldhbmcsIEwuIFguPC9hdXRob3I+PGF1dGhvcj5UZW5nLCBILiBL
-LjwvYXV0aG9yPjxhdXRob3I+WHUsIEwuIFQuPC9hdXRob3I+PGF1dGhvcj5Mb3UsIFguIEsuPC9h
-dXRob3I+PGF1dGhvcj5XYW5nLCBZLjwvYXV0aG9yPjxhdXRob3I+V2VpLCBILiBXLjwvYXV0aG9y
-PjxhdXRob3I+WWFuLCBNLiBKLjwvYXV0aG9yPjwvYXV0aG9ycz48L2NvbnRyaWJ1dG9ycz48YXV0
-aC1hZGRyZXNzPlJlaGFiaWxpdGF0aW9uIE1lZGljaW5lIENlbnRlciwgRGVwYXJ0bWVudCBvZiBB
-bmVzdGhlc2lvbG9neSwgWmhlamlhbmcgUHJvdmluY2lhbCBQZW9wbGUmYXBvcztzIEhvc3BpdGFs
-LCBBZmZpbGlhdGVkIFBlb3BsZSZhcG9zO3MgSG9zcGl0YWwsIEhhbmd6aG91IE1lZGljYWwgQ29s
-bGVnZSwgV2FubmFuIE1lZGljYWwgQ29sbGVnZSBHcmFkdWF0ZSBUcmFpbmluZyBCYXNlLCBIYW5n
-emhvdSwgQ2hpbmEuJiN4RDtTY2hvb2wgb2YgR3JhZHVhdGUsIEppbnpob3UgTWVkaWNhbCBVbml2
-ZXJzaXR5LCBKaW56aG91LCBDaGluYS4mI3hEO1JlaGFiaWxpdGF0aW9uIE1lZGljaW5lIENlbnRl
-ciwgRGVwYXJ0bWVudCBvZiBBbmVzdGhlc2lvbG9neSwgWmhlamlhbmcgUHJvdmluY2lhbCBQZW9w
-bGUmYXBvcztzIEhvc3BpdGFsLCBBZmZpbGlhdGVkIFBlb3BsZSZhcG9zO3MgSG9zcGl0YWwsIEhh
-bmd6aG91IE1lZGljYWwgQ29sbGVnZSwgSGFuZ3pob3UsIENoaW5hLjwvYXV0aC1hZGRyZXNzPjx0
-aXRsZXM+PHRpdGxlPlVsdHJhLWZhc3QtdHJhY2sgY2FyZGlhYyBhbmVzdGhlc2lhIGluIG1pbmlt
-YWxseSBpbnZhc2l2ZSBjYXJkaWFjIHN1cmdlcnk6IGEgcmV0cm9zcGVjdGl2ZSBvYnNlcnZhdGlv
-bmFsIHN0dWR5PC90aXRsZT48c2Vjb25kYXJ5LXRpdGxlPkNhcmRpb3Zhc2MgRGlhZ24gVGhlcjwv
-c2Vjb25kYXJ5LXRpdGxlPjwvdGl0bGVzPjxwZXJpb2RpY2FsPjxmdWxsLXRpdGxlPkNhcmRpb3Zh
-c2MgRGlhZ24gVGhlcjwvZnVsbC10aXRsZT48L3BlcmlvZGljYWw+PHBhZ2VzPjc0MC03NTI8L3Bh
-Z2VzPjx2b2x1bWU+MTQ8L3ZvbHVtZT48bnVtYmVyPjU8L251bWJlcj48ZWRpdGlvbj4yMDI0MTAy
-MjwvZWRpdGlvbj48a2V5d29yZHM+PGtleXdvcmQ+QWx2ZW9sYXItYXJ0ZXJpYWwgb3h5Z2VuIHRl
-bnNpb24gZGlmZmVyZW5jZTwva2V5d29yZD48a2V5d29yZD5taW5pbWFsbHkgaW52YXNpdmUgY2Fy
-ZGlhYyBzdXJnZXJ5IChNSUNTKTwva2V5d29yZD48a2V5d29yZD5veHlnZW5hdGlvbiBpbmRleDwv
-a2V5d29yZD48a2V5d29yZD5yZXNwaXJhdG9yeSBpbmRleDwva2V5d29yZD48a2V5d29yZD51bHRy
-YS1mYXN0LXRyYWNrIGNhcmRpYWMgYW5lc3RoZXNpYSAoVUZUQ0EpPC9rZXl3b3JkPjwva2V5d29y
-ZHM+PGRhdGVzPjx5ZWFyPjIwMjQ8L3llYXI+PHB1Yi1kYXRlcz48ZGF0ZT5PY3QgMzE8L2RhdGU+
-PC9wdWItZGF0ZXM+PC9kYXRlcz48aXNibj4yMjIzLTM2NTIgKFByaW50KSYjeEQ7MjIyMy0zNjUy
-PC9pc2JuPjxhY2Nlc3Npb24tbnVtPjM5NTEzMTQ0PC9hY2Nlc3Npb24tbnVtPjx1cmxzPjwvdXJs
-cz48Y3VzdG9tMT5Db25mbGljdHMgb2YgSW50ZXJlc3Q6IEFsbCBhdXRob3JzIGhhdmUgY29tcGxl
-dGVkIHRoZSBJQ01KRSB1bmlmb3JtIGRpc2Nsb3N1cmUgZm9ybSAoYXZhaWxhYmxlIGF0IGh0dHBz
-Oi8vY2R0LmFtZWdyb3Vwcy5jb20vYXJ0aWNsZS92aWV3LzEwLjIxMDM3L2NkdC0yNC0xNzUvY29p
-ZikuIFRoZSBhdXRob3JzIGhhdmUgbm8gY29uZmxpY3RzIG9mIGludGVyZXN0IHRvIGRlY2xhcmUu
-PC9jdXN0b20xPjxjdXN0b20yPlBNQzExNTM4ODMwPC9jdXN0b20yPjxlbGVjdHJvbmljLXJlc291
-cmNlLW51bT4xMC4yMTAzNy9jZHQtMjQtMTc1PC9lbGVjdHJvbmljLXJlc291cmNlLW51bT48cmVt
-b3RlLWRhdGFiYXNlLXByb3ZpZGVyPk5MTTwvcmVtb3RlLWRhdGFiYXNlLXByb3ZpZGVyPjxsYW5n
-dWFnZT5lbmc8L2xhbmd1YWdlPjwvcmVjb3JkPjwvQ2l0ZT48L0VuZE5vdGU+AG==
-</w:fldData>
+          <w:fldData xml:space="preserve">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</w:fldData>
         </w:fldChar>
       </w:r>
       <w:r>
@@ -20964,44 +21062,7 @@
           <w:szCs w:val="20"/>
         </w:rPr>
         <w:fldChar w:fldCharType="begin">
-          <w:fldData xml:space="preserve">PEVuZE5vdGU+PENpdGU+PEF1dGhvcj5NdTwvQXV0aG9yPjxZZWFyPjIwMTg8L1llYXI+PFJlY051
-bT4xMjwvUmVjTnVtPjxEaXNwbGF5VGV4dD5bMTFdPC9EaXNwbGF5VGV4dD48cmVjb3JkPjxyZWMt
-bnVtYmVyPjEyPC9yZWMtbnVtYmVyPjxmb3JlaWduLWtleXM+PGtleSBhcHA9IkVOIiBkYi1pZD0i
-c3Nwc2FkdHo1cmV4ZDNlZmR4MnhmdHplcDVhMHRzenZyZXN0IiB0aW1lc3RhbXA9IjE3NjkxNDEx
-MDEiPjEyPC9rZXk+PC9mb3JlaWduLWtleXM+PHJlZi10eXBlIG5hbWU9IkpvdXJuYWwgQXJ0aWNs
-ZSI+MTc8L3JlZi10eXBlPjxjb250cmlidXRvcnM+PGF1dGhvcnM+PGF1dGhvcj5NdSwgSi48L2F1
-dGhvcj48YXV0aG9yPkppYW5nLCBULjwvYXV0aG9yPjxhdXRob3I+WHUsIFguIEIuPC9hdXRob3I+
-PGF1dGhvcj5ZdWVuLCBWLiBNLjwvYXV0aG9yPjxhdXRob3I+SXJ3aW4sIE0uIEcuPC9hdXRob3I+
-PC9hdXRob3JzPjwvY29udHJpYnV0b3JzPjxhdXRoLWFkZHJlc3M+RGVwYXJ0bWVudCBvZiBBbmFl
-c3RoZXNpb2xvZ3ksIFVuaXZlcnNpdHkgb2YgSG9uZyBLb25nIFNoZW56aGVuIEhvc3BpdGFsLCBT
-aGVuemhlbiwgQ2hpbmEuJiN4RDtEZXBhcnRtZW50IG9mIEFuYWVzdGhlc2lvbG9neSwgVW5pdmVy
-c2l0eSBvZiBIb25nIEtvbmcgU2hlbnpoZW4gSG9zcGl0YWwsIFNoZW56aGVuLCBDaGluYTsgRGVw
-YXJ0bWVudCBvZiBBbmFlc3RoZXNpb2xvZ3ksIEhvbmcgS29uZyBDaGlsZHJlbiZhcG9zO3MgSG9z
-cGl0YWwsIEhvbmcgS29uZy4gRWxlY3Ryb25pYyBhZGRyZXNzOiB2dGFuZzEzMUBoa3UuaGsuJiN4
-RDtEZXBhcnRtZW50IG9mIEFuYWVzdGhlc2lvbG9neSwgVW5pdmVyc2l0eSBvZiBIb25nIEtvbmcs
-IEhvbmcgS29uZy48L2F1dGgtYWRkcmVzcz48dGl0bGVzPjx0aXRsZT5Db21wYXJpc29uIG9mIHRh
-cmdldC1jb250cm9sbGVkIGluZnVzaW9uIGFuZCBtYW51YWwgaW5mdXNpb24gZm9yIHByb3BvZm9s
-IGFuYWVzdGhlc2lhIGluIGNoaWxkcmVuPC90aXRsZT48c2Vjb25kYXJ5LXRpdGxlPkJyIEogQW5h
-ZXN0aDwvc2Vjb25kYXJ5LXRpdGxlPjwvdGl0bGVzPjxwZXJpb2RpY2FsPjxmdWxsLXRpdGxlPkJy
-IEogQW5hZXN0aDwvZnVsbC10aXRsZT48L3BlcmlvZGljYWw+PHBhZ2VzPjEwNDktMTA1NTwvcGFn
-ZXM+PHZvbHVtZT4xMjA8L3ZvbHVtZT48bnVtYmVyPjU8L251bWJlcj48ZWRpdGlvbj4yMDE4MDIw
-MzwvZWRpdGlvbj48a2V5d29yZHM+PGtleXdvcmQ+QW5lc3RoZXNpYSBSZWNvdmVyeSBQZXJpb2Q8
-L2tleXdvcmQ+PGtleXdvcmQ+QW5lc3RoZXRpY3MsIEludHJhdmVub3VzLyphZG1pbmlzdHJhdGlv
-biAmYW1wOyBkb3NhZ2U8L2tleXdvcmQ+PGtleXdvcmQ+Q2hpbGQ8L2tleXdvcmQ+PGtleXdvcmQ+
-Q2hpbGQsIFByZXNjaG9vbDwva2V5d29yZD48a2V5d29yZD5DaGluYTwva2V5d29yZD48a2V5d29y
-ZD5GZW1hbGU8L2tleXdvcmQ+PGtleXdvcmQ+SHVtYW5zPC9rZXl3b3JkPjxrZXl3b3JkPkluZmFu
-dDwva2V5d29yZD48a2V5d29yZD5JbmZ1c2lvbnMsIEludHJhdmVub3VzPC9rZXl3b3JkPjxrZXl3
-b3JkPk1hbGU8L2tleXdvcmQ+PGtleXdvcmQ+UHJvcG9mb2wvKmFkbWluaXN0cmF0aW9uICZhbXA7
-IGRvc2FnZTwva2V5d29yZD48a2V5d29yZD5UaW1lIEZhY3RvcnM8L2tleXdvcmQ+PGtleXdvcmQ+
-Y2hpbGRyZW48L2tleXdvcmQ+PGtleXdvcmQ+ZW1lcmdlbmNlIGRlbGlyaXVtPC9rZXl3b3JkPjxr
-ZXl3b3JkPnRvdGFsIGkudi4gYW5hZXN0aGVzaWE8L2tleXdvcmQ+PC9rZXl3b3Jkcz48ZGF0ZXM+
-PHllYXI+MjAxODwveWVhcj48cHViLWRhdGVzPjxkYXRlPk1heTwvZGF0ZT48L3B1Yi1kYXRlcz48
-L2RhdGVzPjxpc2JuPjAwMDctMDkxMjwvaXNibj48YWNjZXNzaW9uLW51bT4yOTY2MTM4MjwvYWNj
-ZXNzaW9uLW51bT48dXJscz48L3VybHM+PGVsZWN0cm9uaWMtcmVzb3VyY2UtbnVtPjEwLjEwMTYv
-ai5iamEuMjAxNy4xMS4xMDI8L2VsZWN0cm9uaWMtcmVzb3VyY2UtbnVtPjxyZW1vdGUtZGF0YWJh
-c2UtcHJvdmlkZXI+TkxNPC9yZW1vdGUtZGF0YWJhc2UtcHJvdmlkZXI+PGxhbmd1YWdlPmVuZzwv
-bGFuZ3VhZ2U+PC9yZWNvcmQ+PC9DaXRlPjwvRW5kTm90ZT4A
-</w:fldData>
+          <w:fldData xml:space="preserve">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</w:fldData>
         </w:fldChar>
       </w:r>
       <w:r>
@@ -21021,44 +21082,7 @@
           <w:szCs w:val="20"/>
         </w:rPr>
         <w:fldChar w:fldCharType="begin">
-          <w:fldData xml:space="preserve">PEVuZE5vdGU+PENpdGU+PEF1dGhvcj5NdTwvQXV0aG9yPjxZZWFyPjIwMTg8L1llYXI+PFJlY051
-bT4xMjwvUmVjTnVtPjxEaXNwbGF5VGV4dD5bMTFdPC9EaXNwbGF5VGV4dD48cmVjb3JkPjxyZWMt
-bnVtYmVyPjEyPC9yZWMtbnVtYmVyPjxmb3JlaWduLWtleXM+PGtleSBhcHA9IkVOIiBkYi1pZD0i
-c3Nwc2FkdHo1cmV4ZDNlZmR4MnhmdHplcDVhMHRzenZyZXN0IiB0aW1lc3RhbXA9IjE3NjkxNDEx
-MDEiPjEyPC9rZXk+PC9mb3JlaWduLWtleXM+PHJlZi10eXBlIG5hbWU9IkpvdXJuYWwgQXJ0aWNs
-ZSI+MTc8L3JlZi10eXBlPjxjb250cmlidXRvcnM+PGF1dGhvcnM+PGF1dGhvcj5NdSwgSi48L2F1
-dGhvcj48YXV0aG9yPkppYW5nLCBULjwvYXV0aG9yPjxhdXRob3I+WHUsIFguIEIuPC9hdXRob3I+
-PGF1dGhvcj5ZdWVuLCBWLiBNLjwvYXV0aG9yPjxhdXRob3I+SXJ3aW4sIE0uIEcuPC9hdXRob3I+
-PC9hdXRob3JzPjwvY29udHJpYnV0b3JzPjxhdXRoLWFkZHJlc3M+RGVwYXJ0bWVudCBvZiBBbmFl
-c3RoZXNpb2xvZ3ksIFVuaXZlcnNpdHkgb2YgSG9uZyBLb25nIFNoZW56aGVuIEhvc3BpdGFsLCBT
-aGVuemhlbiwgQ2hpbmEuJiN4RDtEZXBhcnRtZW50IG9mIEFuYWVzdGhlc2lvbG9neSwgVW5pdmVy
-c2l0eSBvZiBIb25nIEtvbmcgU2hlbnpoZW4gSG9zcGl0YWwsIFNoZW56aGVuLCBDaGluYTsgRGVw
-YXJ0bWVudCBvZiBBbmFlc3RoZXNpb2xvZ3ksIEhvbmcgS29uZyBDaGlsZHJlbiZhcG9zO3MgSG9z
-cGl0YWwsIEhvbmcgS29uZy4gRWxlY3Ryb25pYyBhZGRyZXNzOiB2dGFuZzEzMUBoa3UuaGsuJiN4
-RDtEZXBhcnRtZW50IG9mIEFuYWVzdGhlc2lvbG9neSwgVW5pdmVyc2l0eSBvZiBIb25nIEtvbmcs
-IEhvbmcgS29uZy48L2F1dGgtYWRkcmVzcz48dGl0bGVzPjx0aXRsZT5Db21wYXJpc29uIG9mIHRh
-cmdldC1jb250cm9sbGVkIGluZnVzaW9uIGFuZCBtYW51YWwgaW5mdXNpb24gZm9yIHByb3BvZm9s
-IGFuYWVzdGhlc2lhIGluIGNoaWxkcmVuPC90aXRsZT48c2Vjb25kYXJ5LXRpdGxlPkJyIEogQW5h
-ZXN0aDwvc2Vjb25kYXJ5LXRpdGxlPjwvdGl0bGVzPjxwZXJpb2RpY2FsPjxmdWxsLXRpdGxlPkJy
-IEogQW5hZXN0aDwvZnVsbC10aXRsZT48L3BlcmlvZGljYWw+PHBhZ2VzPjEwNDktMTA1NTwvcGFn
-ZXM+PHZvbHVtZT4xMjA8L3ZvbHVtZT48bnVtYmVyPjU8L251bWJlcj48ZWRpdGlvbj4yMDE4MDIw
-MzwvZWRpdGlvbj48a2V5d29yZHM+PGtleXdvcmQ+QW5lc3RoZXNpYSBSZWNvdmVyeSBQZXJpb2Q8
-L2tleXdvcmQ+PGtleXdvcmQ+QW5lc3RoZXRpY3MsIEludHJhdmVub3VzLyphZG1pbmlzdHJhdGlv
-biAmYW1wOyBkb3NhZ2U8L2tleXdvcmQ+PGtleXdvcmQ+Q2hpbGQ8L2tleXdvcmQ+PGtleXdvcmQ+
-Q2hpbGQsIFByZXNjaG9vbDwva2V5d29yZD48a2V5d29yZD5DaGluYTwva2V5d29yZD48a2V5d29y
-ZD5GZW1hbGU8L2tleXdvcmQ+PGtleXdvcmQ+SHVtYW5zPC9rZXl3b3JkPjxrZXl3b3JkPkluZmFu
-dDwva2V5d29yZD48a2V5d29yZD5JbmZ1c2lvbnMsIEludHJhdmVub3VzPC9rZXl3b3JkPjxrZXl3
-b3JkPk1hbGU8L2tleXdvcmQ+PGtleXdvcmQ+UHJvcG9mb2wvKmFkbWluaXN0cmF0aW9uICZhbXA7
-IGRvc2FnZTwva2V5d29yZD48a2V5d29yZD5UaW1lIEZhY3RvcnM8L2tleXdvcmQ+PGtleXdvcmQ+
-Y2hpbGRyZW48L2tleXdvcmQ+PGtleXdvcmQ+ZW1lcmdlbmNlIGRlbGlyaXVtPC9rZXl3b3JkPjxr
-ZXl3b3JkPnRvdGFsIGkudi4gYW5hZXN0aGVzaWE8L2tleXdvcmQ+PC9rZXl3b3Jkcz48ZGF0ZXM+
-PHllYXI+MjAxODwveWVhcj48cHViLWRhdGVzPjxkYXRlPk1heTwvZGF0ZT48L3B1Yi1kYXRlcz48
-L2RhdGVzPjxpc2JuPjAwMDctMDkxMjwvaXNibj48YWNjZXNzaW9uLW51bT4yOTY2MTM4MjwvYWNj
-ZXNzaW9uLW51bT48dXJscz48L3VybHM+PGVsZWN0cm9uaWMtcmVzb3VyY2UtbnVtPjEwLjEwMTYv
-ai5iamEuMjAxNy4xMS4xMDI8L2VsZWN0cm9uaWMtcmVzb3VyY2UtbnVtPjxyZW1vdGUtZGF0YWJh
-c2UtcHJvdmlkZXI+TkxNPC9yZW1vdGUtZGF0YWJhc2UtcHJvdmlkZXI+PGxhbmd1YWdlPmVuZzwv
-bGFuZ3VhZ2U+PC9yZWNvcmQ+PC9DaXRlPjwvRW5kTm90ZT4A
-</w:fldData>
+          <w:fldData xml:space="preserve">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</w:fldData>
         </w:fldChar>
       </w:r>
       <w:r>
@@ -21270,7 +21294,7 @@
           <w:sz w:val="20"/>
           <w:szCs w:val="20"/>
         </w:rPr>
-        <w:instrText xml:space="preserve"> ADDIN EN.CITE &lt;EndNote&gt;&lt;Cite&gt;&lt;Author&gt;Louvet&lt;/Author&gt;&lt;Year&gt;2016&lt;/Year&gt;&lt;RecNum&gt;13&lt;/RecNum&gt;&lt;DisplayText&gt;[12]&lt;/DisplayText&gt;&lt;record&gt;&lt;rec-number&gt;13&lt;/rec-number&gt;&lt;foreign-keys&gt;&lt;key app="EN" db-id="sspsadtz5rexd3efdx2xftzep5a0tszvrest" timestamp="1769141133"&gt;13&lt;/key&gt;&lt;/foreign-keys&gt;&lt;ref-type name="Journal Article"&gt;17&lt;/ref-type&gt;&lt;contributors&gt;&lt;authors&gt;&lt;author&gt;Louvet, N.&lt;/author&gt;&lt;author&gt;Rigouzzo, A.&lt;/author&gt;&lt;author&gt;Sabourdin, N.&lt;/author&gt;&lt;author&gt;Constant, I.&lt;/author&gt;&lt;/authors&gt;&lt;/contributors&gt;&lt;auth-address&gt;Département d&amp;apos;Anesthésie-Réanimation, Hôpital Armand Trousseau, Paris, France.&lt;/auth-address&gt;&lt;titles&gt;&lt;title&gt;Bispectral index under propofol anesthesia in children: a comparative randomized study between TIVA and TCI&lt;/title&gt;&lt;secondary-title&gt;Paediatr Anaesth&lt;/secondary-title&gt;&lt;/titles&gt;&lt;periodical&gt;&lt;full-title&gt;Paediatr Anaesth&lt;/full-title&gt;&lt;/periodical&gt;&lt;pages&gt;899-908&lt;/pages&gt;&lt;volume&gt;26&lt;/volume&gt;&lt;number&gt;9&lt;/number&gt;&lt;keywords&gt;&lt;keyword&gt;Adolescent&lt;/keyword&gt;&lt;keyword&gt;Anesthesia, Intravenous/*methods&lt;/keyword&gt;&lt;keyword&gt;Anesthetics, Intravenous/administration &amp;amp; dosage/*pharmacology&lt;/keyword&gt;&lt;keyword&gt;Child&lt;/keyword&gt;&lt;keyword&gt;Child, Preschool&lt;/keyword&gt;&lt;keyword&gt;Electroencephalography/*drug effects&lt;/keyword&gt;&lt;keyword&gt;Female&lt;/keyword&gt;&lt;keyword&gt;Humans&lt;/keyword&gt;&lt;keyword&gt;Infusions, Intravenous&lt;/keyword&gt;&lt;keyword&gt;Male&lt;/keyword&gt;&lt;keyword&gt;Propofol/administration &amp;amp; dosage/*pharmacology&lt;/keyword&gt;&lt;keyword&gt;Prospective Studies&lt;/keyword&gt;&lt;keyword&gt;bispectral index&lt;/keyword&gt;&lt;keyword&gt;children&lt;/keyword&gt;&lt;keyword&gt;intravenous&lt;/keyword&gt;&lt;keyword&gt;propofol&lt;/keyword&gt;&lt;keyword&gt;remifentanil&lt;/keyword&gt;&lt;/keywords&gt;&lt;dates&gt;&lt;year&gt;2016&lt;/year&gt;&lt;pub-dates&gt;&lt;date&gt;Sep&lt;/date&gt;&lt;/pub-dates&gt;&lt;/dates&gt;&lt;isbn&gt;1155-5645&lt;/isbn&gt;&lt;accession-num&gt;27461767&lt;/accession-num&gt;&lt;urls&gt;&lt;/urls&gt;&lt;electronic-resource-num&gt;10.1111/pan.12957&lt;/electronic-resource-num&gt;&lt;remote-database-provider&gt;NLM&lt;/remote-database-provider&gt;&lt;language&gt;eng&lt;/language&gt;&lt;/record&gt;&lt;/Cite&gt;&lt;/EndNote&gt;</w:instrText>
+        <w:instrText xml:space="preserve"> ADDIN EN.CITE &lt;EndNote&gt;&lt;Cite&gt;&lt;Author&gt;Louvet&lt;/Author&gt;&lt;Year&gt;2016&lt;/Year&gt;&lt;RecNum&gt;13&lt;/RecNum&gt;&lt;DisplayText&gt;[15]&lt;/DisplayText&gt;&lt;record&gt;&lt;rec-number&gt;13&lt;/rec-number&gt;&lt;foreign-keys&gt;&lt;key app="EN" db-id="sspsadtz5rexd3efdx2xftzep5a0tszvrest" timestamp="1769141133"&gt;13&lt;/key&gt;&lt;/foreign-keys&gt;&lt;ref-type name="Journal Article"&gt;17&lt;/ref-type&gt;&lt;contributors&gt;&lt;authors&gt;&lt;author&gt;Louvet, N.&lt;/author&gt;&lt;author&gt;Rigouzzo, A.&lt;/author&gt;&lt;author&gt;Sabourdin, N.&lt;/author&gt;&lt;author&gt;Constant, I.&lt;/author&gt;&lt;/authors&gt;&lt;/contributors&gt;&lt;auth-address&gt;Département d&amp;apos;Anesthésie-Réanimation, Hôpital Armand Trousseau, Paris, France.&lt;/auth-address&gt;&lt;titles&gt;&lt;title&gt;Bispectral index under propofol anesthesia in children: a comparative randomized study between TIVA and TCI&lt;/title&gt;&lt;secondary-title&gt;Paediatr Anaesth&lt;/secondary-title&gt;&lt;/titles&gt;&lt;periodical&gt;&lt;full-title&gt;Paediatr Anaesth&lt;/full-title&gt;&lt;/periodical&gt;&lt;pages&gt;899-908&lt;/pages&gt;&lt;volume&gt;26&lt;/volume&gt;&lt;number&gt;9&lt;/number&gt;&lt;keywords&gt;&lt;keyword&gt;Adolescent&lt;/keyword&gt;&lt;keyword&gt;Anesthesia, Intravenous/*methods&lt;/keyword&gt;&lt;keyword&gt;Anesthetics, Intravenous/administration &amp;amp; dosage/*pharmacology&lt;/keyword&gt;&lt;keyword&gt;Child&lt;/keyword&gt;&lt;keyword&gt;Child, Preschool&lt;/keyword&gt;&lt;keyword&gt;Electroencephalography/*drug effects&lt;/keyword&gt;&lt;keyword&gt;Female&lt;/keyword&gt;&lt;keyword&gt;Humans&lt;/keyword&gt;&lt;keyword&gt;Infusions, Intravenous&lt;/keyword&gt;&lt;keyword&gt;Male&lt;/keyword&gt;&lt;keyword&gt;Propofol/administration &amp;amp; dosage/*pharmacology&lt;/keyword&gt;&lt;keyword&gt;Prospective Studies&lt;/keyword&gt;&lt;keyword&gt;bispectral index&lt;/keyword&gt;&lt;keyword&gt;children&lt;/keyword&gt;&lt;keyword&gt;intravenous&lt;/keyword&gt;&lt;keyword&gt;propofol&lt;/keyword&gt;&lt;keyword&gt;remifentanil&lt;/keyword&gt;&lt;/keywords&gt;&lt;dates&gt;&lt;year&gt;2016&lt;/year&gt;&lt;pub-dates&gt;&lt;date&gt;Sep&lt;/date&gt;&lt;/pub-dates&gt;&lt;/dates&gt;&lt;isbn&gt;1155-5645&lt;/isbn&gt;&lt;accession-num&gt;27461767&lt;/accession-num&gt;&lt;urls&gt;&lt;/urls&gt;&lt;electronic-resource-num&gt;10.1111/pan.12957&lt;/electronic-resource-num&gt;&lt;remote-database-provider&gt;NLM&lt;/remote-database-provider&gt;&lt;language&gt;eng&lt;/language&gt;&lt;/record&gt;&lt;/Cite&gt;&lt;/EndNote&gt; </w:instrText>
       </w:r>
       <w:r>
         <w:rPr>
@@ -21506,7 +21530,7 @@
           <w:sz w:val="20"/>
           <w:szCs w:val="20"/>
         </w:rPr>
-        <w:instrText xml:space="preserve"> ADDIN EN.CITE &lt;EndNote&gt;&lt;Cite&gt;&lt;Author&gt;Wong&lt;/Author&gt;&lt;Year&gt;2011&lt;/Year&gt;&lt;RecNum&gt;14&lt;/RecNum&gt;&lt;DisplayText&gt;[13]&lt;/DisplayText&gt;&lt;record&gt;&lt;rec-number&gt;14&lt;/rec-number&gt;&lt;foreign-keys&gt;&lt;key app="EN" db-id="sspsadtz5rexd3efdx2xftzep5a0tszvrest" timestamp="1769141161"&gt;14&lt;/key&gt;&lt;/foreign-keys&gt;&lt;ref-type name="Journal Article"&gt;17&lt;/ref-type&gt;&lt;contributors&gt;&lt;authors&gt;&lt;author&gt;Wong, G. L.&lt;/author&gt;&lt;author&gt;Morton, N. S.&lt;/author&gt;&lt;/authors&gt;&lt;/contributors&gt;&lt;auth-address&gt;Department of Anesthesia, Royal Hospital for Sick Children, Yorkhill, Glasgow, UK. gracewong531@hotmail.com&lt;/auth-address&gt;&lt;titles&gt;&lt;title&gt;Total intravenous anesthesia (TIVA) in pediatric cardiac anesthesia&lt;/title&gt;&lt;secondary-title&gt;Paediatr Anaesth&lt;/secondary-title&gt;&lt;/titles&gt;&lt;periodical&gt;&lt;full-title&gt;Paediatr Anaesth&lt;/full-title&gt;&lt;/periodical&gt;&lt;pages&gt;560-6&lt;/pages&gt;&lt;volume&gt;21&lt;/volume&gt;&lt;number&gt;5&lt;/number&gt;&lt;edition&gt;20110314&lt;/edition&gt;&lt;keywords&gt;&lt;keyword&gt;Anesthesia, Intravenous/*methods&lt;/keyword&gt;&lt;keyword&gt;*Anesthetics, Intravenous/pharmacokinetics/pharmacology&lt;/keyword&gt;&lt;keyword&gt;Cardiac Surgical Procedures/*methods&lt;/keyword&gt;&lt;keyword&gt;Cardiopulmonary Bypass&lt;/keyword&gt;&lt;keyword&gt;Child&lt;/keyword&gt;&lt;keyword&gt;Child, Preschool&lt;/keyword&gt;&lt;keyword&gt;Humans&lt;/keyword&gt;&lt;keyword&gt;Infant&lt;/keyword&gt;&lt;keyword&gt;Infant, Newborn&lt;/keyword&gt;&lt;keyword&gt;Infusions, Intravenous&lt;/keyword&gt;&lt;keyword&gt;Ischemic Preconditioning, Myocardial&lt;/keyword&gt;&lt;keyword&gt;Propofol/pharmacokinetics/pharmacology&lt;/keyword&gt;&lt;/keywords&gt;&lt;dates&gt;&lt;year&gt;2011&lt;/year&gt;&lt;pub-dates&gt;&lt;date&gt;May&lt;/date&gt;&lt;/pub-dates&gt;&lt;/dates&gt;&lt;isbn&gt;1155-5645&lt;/isbn&gt;&lt;accession-num&gt;21401799&lt;/accession-num&gt;&lt;urls&gt;&lt;/urls&gt;&lt;electronic-resource-num&gt;10.1111/j.1460-9592.2011.03565.x&lt;/electronic-resource-num&gt;&lt;remote-database-provider&gt;NLM&lt;/remote-database-provider&gt;&lt;language&gt;eng&lt;/language&gt;&lt;/record&gt;&lt;/Cite&gt;&lt;/EndNote&gt;</w:instrText>
+        <w:instrText xml:space="preserve"> ADDIN EN.CITE &lt;EndNote&gt;&lt;Cite&gt;&lt;Author&gt;Wong&lt;/Author&gt;&lt;Year&gt;2011&lt;/Year&gt;&lt;RecNum&gt;14&lt;/RecNum&gt;&lt;DisplayText&gt;[16]&lt;/DisplayText&gt;&lt;record&gt;&lt;rec-number&gt;14&lt;/rec-number&gt;&lt;foreign-keys&gt;&lt;key app="EN" db-id="sspsadtz5rexd3efdx2xftzep5a0tszvrest" timestamp="1769141161"&gt;14&lt;/key&gt;&lt;/foreign-keys&gt;&lt;ref-type name="Journal Article"&gt;17&lt;/ref-type&gt;&lt;contributors&gt;&lt;authors&gt;&lt;author&gt;Wong, G. L.&lt;/author&gt;&lt;author&gt;Morton, N. S.&lt;/author&gt;&lt;/authors&gt;&lt;/contributors&gt;&lt;auth-address&gt;Department of Anesthesia, Royal Hospital for Sick Children, Yorkhill, Glasgow, UK. gracewong531@hotmail.com&lt;/auth-address&gt;&lt;titles&gt;&lt;title&gt;Total intravenous anesthesia (TIVA) in pediatric cardiac anesthesia&lt;/title&gt;&lt;secondary-title&gt;Paediatr Anaesth&lt;/secondary-title&gt;&lt;/titles&gt;&lt;periodical&gt;&lt;full-title&gt;Paediatr Anaesth&lt;/full-title&gt;&lt;/periodical&gt;&lt;pages&gt;560-6&lt;/pages&gt;&lt;volume&gt;21&lt;/volume&gt;&lt;number&gt;5&lt;/number&gt;&lt;edition&gt;20110314&lt;/edition&gt;&lt;keywords&gt;&lt;keyword&gt;Anesthesia, Intravenous/*methods&lt;/keyword&gt;&lt;keyword&gt;*Anesthetics, Intravenous/pharmacokinetics/pharmacology&lt;/keyword&gt;&lt;keyword&gt;Cardiac Surgical Procedures/*methods&lt;/keyword&gt;&lt;keyword&gt;Cardiopulmonary Bypass&lt;/keyword&gt;&lt;keyword&gt;Child&lt;/keyword&gt;&lt;keyword&gt;Child, Preschool&lt;/keyword&gt;&lt;keyword&gt;Humans&lt;/keyword&gt;&lt;keyword&gt;Infant&lt;/keyword&gt;&lt;keyword&gt;Infant, Newborn&lt;/keyword&gt;&lt;keyword&gt;Infusions, Intravenous&lt;/keyword&gt;&lt;keyword&gt;Ischemic Preconditioning, Myocardial&lt;/keyword&gt;&lt;keyword&gt;Propofol/pharmacokinetics/pharmacology&lt;/keyword&gt;&lt;/keywords&gt;&lt;dates&gt;&lt;year&gt;2011&lt;/year&gt;&lt;pub-dates&gt;&lt;date&gt;May&lt;/date&gt;&lt;/pub-dates&gt;&lt;/dates&gt;&lt;isbn&gt;1155-5645&lt;/isbn&gt;&lt;accession-num&gt;21401799&lt;/accession-num&gt;&lt;urls&gt;&lt;/urls&gt;&lt;electronic-resource-num&gt;10.1111/j.1460-9592.2011.03565.x&lt;/electronic-resource-num&gt;&lt;remote-database-provider&gt;NLM&lt;/remote-database-provider&gt;&lt;language&gt;eng&lt;/language&gt;&lt;/record&gt;&lt;/Cite&gt;&lt;/EndNote&gt; </w:instrText>
       </w:r>
       <w:r>
         <w:rPr>
@@ -22316,59 +22340,7 @@
           <w:szCs w:val="20"/>
         </w:rPr>
         <w:fldChar w:fldCharType="begin">
-          <w:fldData xml:space="preserve">PEVuZE5vdGU+PENpdGU+PEF1dGhvcj5CYWk8L0F1dGhvcj48WWVhcj4yMDI2PC9ZZWFyPjxSZWNO
-dW0+MTk8L1JlY051bT48RGlzcGxheVRleHQ+WzE0XTwvRGlzcGxheVRleHQ+PHJlY29yZD48cmVj
-LW51bWJlcj4xOTwvcmVjLW51bWJlcj48Zm9yZWlnbi1rZXlzPjxrZXkgYXBwPSJFTiIgZGItaWQ9
-InNzcHNhZHR6NXJleGQzZWZkeDJ4ZnR6ZXA1YTB0c3p2cmVzdCIgdGltZXN0YW1wPSIxNzg3OTM4
-OTI0Ij4xOTwva2V5PjwvZm9yZWlnbi1rZXlzPjxyZWYtdHlwZSBuYW1lPSJKb3VybmFsIEFydGlj
-bGUiPjE3PC9yZWYtdHlwZT48Y29udHJpYnV0b3JzPjxhdXRob3JzPjxhdXRob3I+QmFpLCBZLiBY
-LjwvYXV0aG9yPjxhdXRob3I+TGksIFguPC9hdXRob3I+PGF1dGhvcj5DaGVuLCBTLiBRLjwvYXV0
-aG9yPjxhdXRob3I+WHUsIFouIFouPC9hdXRob3I+PGF1dGhvcj5XYW5nLCBZLiBULjwvYXV0aG9y
-PjxhdXRob3I+WmhvdSwgRi4gTC48L2F1dGhvcj48YXV0aG9yPld1LCBRLiBQLjwvYXV0aG9yPjwv
-YXV0aG9ycz48L2NvbnRyaWJ1dG9ycz48YXV0aC1hZGRyZXNzPkRlcGFydG1lbnQgb2YgQW5lc3Ro
-ZXNpb2xvZ3ksIFVuaW9uIEhvc3BpdGFsLCBUb25namkgTWVkaWNhbCBDb2xsZWdlLCBIdWF6aG9u
-ZyBVbml2ZXJzaXR5IG9mIFNjaWVuY2UgYW5kIFRlY2hub2xvZ3ksIFd1aGFuIDQzMDAyMiwgQ2hp
-bmEuJiN4RDtEZXBhcnRtZW50IG9mIEFuZXN0aGVzaW9sb2d5LCBSZW5taW4gSG9zcGl0YWwgb2Yg
-V3VoYW4gVW5pdmVyc2l0eSwgV3VoYW4gNDMwMDYwLCBDaGluYS4mI3hEO0RlcGFydG1lbnQgb2Yg
-QW5lc3RoZXNpb2xvZ3ksIFVuaW9uIEhvc3BpdGFsLCBUb25namkgTWVkaWNhbCBDb2xsZWdlLCBI
-dWF6aG9uZyBVbml2ZXJzaXR5IG9mIFNjaWVuY2UgYW5kIFRlY2hub2xvZ3ksIFd1aGFuIDQzMDAy
-MiwgQ2hpbmEuIEVsZWN0cm9uaWMgYWRkcmVzczogd3FwMTk2OEAxNjMuY29tLjwvYXV0aC1hZGRy
-ZXNzPjx0aXRsZXM+PHRpdGxlPkFzc29jaWF0aW9uIG9mIHRhcmdldC1jb250cm9sbGVkIHZlcnN1
-cyBtYW51YWxseSBjb250cm9sbGVkIGluZnVzaW9uIHdpdGggcG9zdG9wZXJhdGl2ZSByZWNvdmVy
-eSBvdXRjb21lcyBpbiBlbGRlcmx5IGNhcmRpYWMgc3VyZ2VyeSBwYXRpZW50czogYW4gaW50ZXJu
-YXRpb25hbCBtdWx0aS1jb2hvcnQgc3R1ZHk8L3RpdGxlPjxzZWNvbmRhcnktdGl0bGU+SiBDbGlu
-IEFuZXN0aDwvc2Vjb25kYXJ5LXRpdGxlPjwvdGl0bGVzPjxwZXJpb2RpY2FsPjxmdWxsLXRpdGxl
-PkogQ2xpbiBBbmVzdGg8L2Z1bGwtdGl0bGU+PC9wZXJpb2RpY2FsPjxwYWdlcz4xMTIxNjE8L3Bh
-Z2VzPjx2b2x1bWU+MTExPC92b2x1bWU+PGVkaXRpb24+MjAyNjAzMDQ8L2VkaXRpb24+PGtleXdv
-cmRzPjxrZXl3b3JkPkh1bWFuczwva2V5d29yZD48a2V5d29yZD4qQ2FyZGlhYyBTdXJnaWNhbCBQ
-cm9jZWR1cmVzL2FkdmVyc2UgZWZmZWN0czwva2V5d29yZD48a2V5d29yZD5GZW1hbGU8L2tleXdv
-cmQ+PGtleXdvcmQ+UmV0cm9zcGVjdGl2ZSBTdHVkaWVzPC9rZXl3b3JkPjxrZXl3b3JkPkFnZWQ8
-L2tleXdvcmQ+PGtleXdvcmQ+KlByb3BvZm9sL2FkbWluaXN0cmF0aW9uICZhbXA7IGRvc2FnZS9h
-ZHZlcnNlIGVmZmVjdHMvcGhhcm1hY29raW5ldGljczwva2V5d29yZD48a2V5d29yZD5MZW5ndGgg
-b2YgU3RheS9zdGF0aXN0aWNzICZhbXA7IG51bWVyaWNhbCBkYXRhPC9rZXl3b3JkPjxrZXl3b3Jk
-PkluZnVzaW9ucywgSW50cmF2ZW5vdXMvbWV0aG9kczwva2V5d29yZD48a2V5d29yZD5NYWxlPC9r
-ZXl3b3JkPjxrZXl3b3JkPipQb3N0b3BlcmF0aXZlIENvbXBsaWNhdGlvbnMvZXBpZGVtaW9sb2d5
-L2V0aW9sb2d5PC9rZXl3b3JkPjxrZXl3b3JkPipBbmVzdGhldGljcywgSW50cmF2ZW5vdXMvYWRt
-aW5pc3RyYXRpb24gJmFtcDsgZG9zYWdlL2FkdmVyc2U8L2tleXdvcmQ+PGtleXdvcmQ+ZWZmZWN0
-cy9waGFybWFjb2tpbmV0aWNzPC9rZXl3b3JkPjxrZXl3b3JkPipSZW1pZmVudGFuaWwvYWRtaW5p
-c3RyYXRpb24gJmFtcDsgZG9zYWdlPC9rZXl3b3JkPjxrZXl3b3JkPkFnZWQsIDgwIGFuZCBvdmVy
-PC9rZXl3b3JkPjxrZXl3b3JkPkhvc3BpdGFsIE1vcnRhbGl0eTwva2V5d29yZD48a2V5d29yZD5I
-ZW1vZHluYW1pY3MvZHJ1ZyBlZmZlY3RzPC9rZXl3b3JkPjxrZXl3b3JkPkdlcmlhdHJpYyBBbmVz
-dGhlc2lhPC9rZXl3b3JkPjxrZXl3b3JkPkludGVuc2l2ZSBDYXJlIFVuaXRzL3N0YXRpc3RpY3Mg
-JmFtcDsgbnVtZXJpY2FsIGRhdGE8L2tleXdvcmQ+PGtleXdvcmQ+Q2FyZGlhYyBzdXJnZXJ5PC9r
-ZXl3b3JkPjxrZXl3b3JkPkhlbW9keW5hbWljIHN0YWJpbGl0eTwva2V5d29yZD48a2V5d29yZD5Q
-b3N0b3BlcmF0aXZlIHJlY292ZXJ5PC9rZXl3b3JkPjxrZXl3b3JkPlRhcmdldC1jb250cm9sbGVk
-IGluZnVzaW9uPC9rZXl3b3JkPjwva2V5d29yZHM+PGRhdGVzPjx5ZWFyPjIwMjY8L3llYXI+PHB1
-Yi1kYXRlcz48ZGF0ZT5BcHI8L2RhdGU+PC9wdWItZGF0ZXM+PC9kYXRlcz48aXNibj4wOTUyLTgx
-ODA8L2lzYm4+PGFjY2Vzc2lvbi1udW0+NDE3ODAyNjQ8L2FjY2Vzc2lvbi1udW0+PHVybHM+PC91
-cmxzPjxjdXN0b20xPkRlY2xhcmF0aW9uIG9mIGNvbXBldGluZyBpbnRlcmVzdCBUaGUgYXV0aG9y
-cyBkZWNsYXJlIHRoZSBmb2xsb3dpbmcgZmluYW5jaWFsIGludGVyZXN0cy9wZXJzb25hbCByZWxh
-dGlvbnNoaXBzIHdoaWNoIG1heSBiZSBjb25zaWRlcmVkIGFzIHBvdGVudGlhbCBjb21wZXRpbmcg
-aW50ZXJlc3RzOjwvY3VzdG9tMT48ZWxlY3Ryb25pYy1yZXNvdXJjZS1udW0+MTAuMTAxNi9qLmpj
-bGluYW5lLjIwMjYuMTEyMTYxPC9lbGVjdHJvbmljLXJlc291cmNlLW51bT48cmVtb3RlLWRhdGFi
-YXNlLXByb3ZpZGVyPk5MTTwvcmVtb3RlLWRhdGFiYXNlLXByb3ZpZGVyPjxsYW5ndWFnZT5lbmc8
-L2xhbmd1YWdlPjwvcmVjb3JkPjwvQ2l0ZT48L0VuZE5vdGU+AG==
-</w:fldData>
+          <w:fldData xml:space="preserve">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</w:fldData>
         </w:fldChar>
       </w:r>
       <w:r>
@@ -22388,59 +22360,7 @@
           <w:szCs w:val="20"/>
         </w:rPr>
         <w:fldChar w:fldCharType="begin">
-          <w:fldData xml:space="preserve">PEVuZE5vdGU+PENpdGU+PEF1dGhvcj5CYWk8L0F1dGhvcj48WWVhcj4yMDI2PC9ZZWFyPjxSZWNO
-dW0+MTk8L1JlY051bT48RGlzcGxheVRleHQ+WzE0XTwvRGlzcGxheVRleHQ+PHJlY29yZD48cmVj
-LW51bWJlcj4xOTwvcmVjLW51bWJlcj48Zm9yZWlnbi1rZXlzPjxrZXkgYXBwPSJFTiIgZGItaWQ9
-InNzcHNhZHR6NXJleGQzZWZkeDJ4ZnR6ZXA1YTB0c3p2cmVzdCIgdGltZXN0YW1wPSIxNzg3OTM4
-OTI0Ij4xOTwva2V5PjwvZm9yZWlnbi1rZXlzPjxyZWYtdHlwZSBuYW1lPSJKb3VybmFsIEFydGlj
-bGUiPjE3PC9yZWYtdHlwZT48Y29udHJpYnV0b3JzPjxhdXRob3JzPjxhdXRob3I+QmFpLCBZLiBY
-LjwvYXV0aG9yPjxhdXRob3I+TGksIFguPC9hdXRob3I+PGF1dGhvcj5DaGVuLCBTLiBRLjwvYXV0
-aG9yPjxhdXRob3I+WHUsIFouIFouPC9hdXRob3I+PGF1dGhvcj5XYW5nLCBZLiBULjwvYXV0aG9y
-PjxhdXRob3I+WmhvdSwgRi4gTC48L2F1dGhvcj48YXV0aG9yPld1LCBRLiBQLjwvYXV0aG9yPjwv
-YXV0aG9ycz48L2NvbnRyaWJ1dG9ycz48YXV0aC1hZGRyZXNzPkRlcGFydG1lbnQgb2YgQW5lc3Ro
-ZXNpb2xvZ3ksIFVuaW9uIEhvc3BpdGFsLCBUb25namkgTWVkaWNhbCBDb2xsZWdlLCBIdWF6aG9u
-ZyBVbml2ZXJzaXR5IG9mIFNjaWVuY2UgYW5kIFRlY2hub2xvZ3ksIFd1aGFuIDQzMDAyMiwgQ2hp
-bmEuJiN4RDtEZXBhcnRtZW50IG9mIEFuZXN0aGVzaW9sb2d5LCBSZW5taW4gSG9zcGl0YWwgb2Yg
-V3VoYW4gVW5pdmVyc2l0eSwgV3VoYW4gNDMwMDYwLCBDaGluYS4mI3hEO0RlcGFydG1lbnQgb2Yg
-QW5lc3RoZXNpb2xvZ3ksIFVuaW9uIEhvc3BpdGFsLCBUb25namkgTWVkaWNhbCBDb2xsZWdlLCBI
-dWF6aG9uZyBVbml2ZXJzaXR5IG9mIFNjaWVuY2UgYW5kIFRlY2hub2xvZ3ksIFd1aGFuIDQzMDAy
-MiwgQ2hpbmEuIEVsZWN0cm9uaWMgYWRkcmVzczogd3FwMTk2OEAxNjMuY29tLjwvYXV0aC1hZGRy
-ZXNzPjx0aXRsZXM+PHRpdGxlPkFzc29jaWF0aW9uIG9mIHRhcmdldC1jb250cm9sbGVkIHZlcnN1
-cyBtYW51YWxseSBjb250cm9sbGVkIGluZnVzaW9uIHdpdGggcG9zdG9wZXJhdGl2ZSByZWNvdmVy
-eSBvdXRjb21lcyBpbiBlbGRlcmx5IGNhcmRpYWMgc3VyZ2VyeSBwYXRpZW50czogYW4gaW50ZXJu
-YXRpb25hbCBtdWx0aS1jb2hvcnQgc3R1ZHk8L3RpdGxlPjxzZWNvbmRhcnktdGl0bGU+SiBDbGlu
-IEFuZXN0aDwvc2Vjb25kYXJ5LXRpdGxlPjwvdGl0bGVzPjxwZXJpb2RpY2FsPjxmdWxsLXRpdGxl
-PkogQ2xpbiBBbmVzdGg8L2Z1bGwtdGl0bGU+PC9wZXJpb2RpY2FsPjxwYWdlcz4xMTIxNjE8L3Bh
-Z2VzPjx2b2x1bWU+MTExPC92b2x1bWU+PGVkaXRpb24+MjAyNjAzMDQ8L2VkaXRpb24+PGtleXdv
-cmRzPjxrZXl3b3JkPkh1bWFuczwva2V5d29yZD48a2V5d29yZD4qQ2FyZGlhYyBTdXJnaWNhbCBQ
-cm9jZWR1cmVzL2FkdmVyc2UgZWZmZWN0czwva2V5d29yZD48a2V5d29yZD5GZW1hbGU8L2tleXdv
-cmQ+PGtleXdvcmQ+UmV0cm9zcGVjdGl2ZSBTdHVkaWVzPC9rZXl3b3JkPjxrZXl3b3JkPkFnZWQ8
-L2tleXdvcmQ+PGtleXdvcmQ+KlByb3BvZm9sL2FkbWluaXN0cmF0aW9uICZhbXA7IGRvc2FnZS9h
-ZHZlcnNlIGVmZmVjdHMvcGhhcm1hY29raW5ldGljczwva2V5d29yZD48a2V5d29yZD5MZW5ndGgg
-b2YgU3RheS9zdGF0aXN0aWNzICZhbXA7IG51bWVyaWNhbCBkYXRhPC9rZXl3b3JkPjxrZXl3b3Jk
-PkluZnVzaW9ucywgSW50cmF2ZW5vdXMvbWV0aG9kczwva2V5d29yZD48a2V5d29yZD5NYWxlPC9r
-ZXl3b3JkPjxrZXl3b3JkPipQb3N0b3BlcmF0aXZlIENvbXBsaWNhdGlvbnMvZXBpZGVtaW9sb2d5
-L2V0aW9sb2d5PC9rZXl3b3JkPjxrZXl3b3JkPipBbmVzdGhldGljcywgSW50cmF2ZW5vdXMvYWRt
-aW5pc3RyYXRpb24gJmFtcDsgZG9zYWdlL2FkdmVyc2U8L2tleXdvcmQ+PGtleXdvcmQ+ZWZmZWN0
-cy9waGFybWFjb2tpbmV0aWNzPC9rZXl3b3JkPjxrZXl3b3JkPipSZW1pZmVudGFuaWwvYWRtaW5p
-c3RyYXRpb24gJmFtcDsgZG9zYWdlPC9rZXl3b3JkPjxrZXl3b3JkPkFnZWQsIDgwIGFuZCBvdmVy
-PC9rZXl3b3JkPjxrZXl3b3JkPkhvc3BpdGFsIE1vcnRhbGl0eTwva2V5d29yZD48a2V5d29yZD5I
-ZW1vZHluYW1pY3MvZHJ1ZyBlZmZlY3RzPC9rZXl3b3JkPjxrZXl3b3JkPkdlcmlhdHJpYyBBbmVz
-dGhlc2lhPC9rZXl3b3JkPjxrZXl3b3JkPkludGVuc2l2ZSBDYXJlIFVuaXRzL3N0YXRpc3RpY3Mg
-JmFtcDsgbnVtZXJpY2FsIGRhdGE8L2tleXdvcmQ+PGtleXdvcmQ+Q2FyZGlhYyBzdXJnZXJ5PC9r
-ZXl3b3JkPjxrZXl3b3JkPkhlbW9keW5hbWljIHN0YWJpbGl0eTwva2V5d29yZD48a2V5d29yZD5Q
-b3N0b3BlcmF0aXZlIHJlY292ZXJ5PC9rZXl3b3JkPjxrZXl3b3JkPlRhcmdldC1jb250cm9sbGVk
-IGluZnVzaW9uPC9rZXl3b3JkPjwva2V5d29yZHM+PGRhdGVzPjx5ZWFyPjIwMjY8L3llYXI+PHB1
-Yi1kYXRlcz48ZGF0ZT5BcHI8L2RhdGU+PC9wdWItZGF0ZXM+PC9kYXRlcz48aXNibj4wOTUyLTgx
-ODA8L2lzYm4+PGFjY2Vzc2lvbi1udW0+NDE3ODAyNjQ8L2FjY2Vzc2lvbi1udW0+PHVybHM+PC91
-cmxzPjxjdXN0b20xPkRlY2xhcmF0aW9uIG9mIGNvbXBldGluZyBpbnRlcmVzdCBUaGUgYXV0aG9y
-cyBkZWNsYXJlIHRoZSBmb2xsb3dpbmcgZmluYW5jaWFsIGludGVyZXN0cy9wZXJzb25hbCByZWxh
-dGlvbnNoaXBzIHdoaWNoIG1heSBiZSBjb25zaWRlcmVkIGFzIHBvdGVudGlhbCBjb21wZXRpbmcg
-aW50ZXJlc3RzOjwvY3VzdG9tMT48ZWxlY3Ryb25pYy1yZXNvdXJjZS1udW0+MTAuMTAxNi9qLmpj
-bGluYW5lLjIwMjYuMTEyMTYxPC9lbGVjdHJvbmljLXJlc291cmNlLW51bT48cmVtb3RlLWRhdGFi
-YXNlLXByb3ZpZGVyPk5MTTwvcmVtb3RlLWRhdGFiYXNlLXByb3ZpZGVyPjxsYW5ndWFnZT5lbmc8
-L2xhbmd1YWdlPjwvcmVjb3JkPjwvQ2l0ZT48L0VuZE5vdGU+AG==
-</w:fldData>
+          <w:fldData xml:space="preserve">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</w:fldData>
         </w:fldChar>
       </w:r>
       <w:r>
@@ -24653,7 +24573,7 @@
           <w:sz w:val="20"/>
           <w:szCs w:val="20"/>
         </w:rPr>
-        <w:instrText xml:space="preserve"> ADDIN EN.CITE &lt;EndNote&gt;&lt;Cite&gt;&lt;Author&gt;Balasubramanyam&lt;/Author&gt;&lt;Year&gt;2019&lt;/Year&gt;&lt;RecNum&gt;20&lt;/RecNum&gt;&lt;DisplayText&gt;[15]&lt;/DisplayText&gt;&lt;record&gt;&lt;rec-number&gt;20&lt;/rec-number&gt;&lt;foreign-keys&gt;&lt;key app="EN" db-id="sspsadtz5rexd3efdx2xftzep5a0tszvrest" timestamp="1787939155"&gt;20&lt;/key&gt;&lt;/foreign-keys&gt;&lt;ref-type name="Journal Article"&gt;17&lt;/ref-type&gt;&lt;contributors&gt;&lt;authors&gt;&lt;author&gt;Balasubramanyam, Uma&lt;/author&gt;&lt;author&gt;Kapoor, Poonam Malhotra&lt;/author&gt;&lt;/authors&gt;&lt;/contributors&gt;&lt;titles&gt;&lt;title&gt;Anesthetic challenges in minimally invasive cardiac surgery&lt;/title&gt;&lt;secondary-title&gt;Journal of Cardiac Critical Care TSS&lt;/secondary-title&gt;&lt;/titles&gt;&lt;periodical&gt;&lt;full-title&gt;Journal of Cardiac Critical Care TSS&lt;/full-title&gt;&lt;/periodical&gt;&lt;pages&gt;28-35&lt;/pages&gt;&lt;volume&gt;3&lt;/volume&gt;&lt;number&gt;1&lt;/number&gt;&lt;dates&gt;&lt;year&gt;2019&lt;/year&gt;&lt;/dates&gt;&lt;isbn&gt;2457-0206&lt;/isbn&gt;&lt;urls&gt;&lt;/urls&gt;&lt;/record&gt;&lt;/Cite&gt;&lt;/EndNote&gt;</w:instrText>
+        <w:instrText xml:space="preserve"> ADDIN EN.CITE &lt;EndNote&gt;&lt;Cite&gt;&lt;Author&gt;Balasubramanyam&lt;/Author&gt;&lt;Year&gt;2019&lt;/Year&gt;&lt;RecNum&gt;20&lt;/RecNum&gt;&lt;DisplayText&gt;[18]&lt;/DisplayText&gt;&lt;record&gt;&lt;rec-number&gt;20&lt;/rec-number&gt;&lt;foreign-keys&gt;&lt;key app="EN" db-id="sspsadtz5rexd3efdx2xftzep5a0tszvrest" timestamp="1787939155"&gt;20&lt;/key&gt;&lt;/foreign-keys&gt;&lt;ref-type name="Journal Article"&gt;17&lt;/ref-type&gt;&lt;contributors&gt;&lt;authors&gt;&lt;author&gt;Balasubramanyam, Uma&lt;/author&gt;&lt;author&gt;Kapoor, Poonam Malhotra&lt;/author&gt;&lt;/authors&gt;&lt;/contributors&gt;&lt;titles&gt;&lt;title&gt;Anesthetic challenges in minimally invasive cardiac surgery&lt;/title&gt;&lt;secondary-title&gt;Journal of Cardiac Critical Care TSS&lt;/secondary-title&gt;&lt;/titles&gt;&lt;periodical&gt;&lt;full-title&gt;Journal of Cardiac Critical Care TSS&lt;/full-title&gt;&lt;/periodical&gt;&lt;pages&gt;28-35&lt;/pages&gt;&lt;volume&gt;3&lt;/volume&gt;&lt;number&gt;1&lt;/number&gt;&lt;dates&gt;&lt;year&gt;2019&lt;/year&gt;&lt;/dates&gt;&lt;isbn&gt;2457-0206&lt;/isbn&gt;&lt;urls&gt;&lt;/urls&gt;&lt;/record&gt;&lt;/Cite&gt;&lt;/EndNote&gt; </w:instrText>
       </w:r>
       <w:r>
         <w:rPr>
@@ -24869,7 +24789,7 @@
           <w:sz w:val="20"/>
           <w:szCs w:val="20"/>
         </w:rPr>
-        <w:instrText xml:space="preserve"> ADDIN EN.CITE &lt;EndNote&gt;&lt;Cite&gt;&lt;Author&gt;Malik&lt;/Author&gt;&lt;Year&gt;2016&lt;/Year&gt;&lt;RecNum&gt;21&lt;/RecNum&gt;&lt;DisplayText&gt;[16, 17]&lt;/DisplayText&gt;&lt;record&gt;&lt;rec-number&gt;21&lt;/rec-number&gt;&lt;foreign-keys&gt;&lt;key app="EN" db-id="sspsadtz5rexd3efdx2xftzep5a0tszvrest" timestamp="1787939241"&gt;21&lt;/key&gt;&lt;/foreign-keys&gt;&lt;ref-type name="Journal Article"&gt;17&lt;/ref-type&gt;&lt;contributors&gt;&lt;authors&gt;&lt;author&gt;Malik, Vishwas&lt;/author&gt;&lt;author&gt;Jha, Ajay Kumar&lt;/author&gt;&lt;author&gt;Kapoor, Poonam Malhotra&lt;/author&gt;&lt;/authors&gt;&lt;/contributors&gt;&lt;titles&gt;&lt;title&gt;Anesthetic challenges in minimally invasive cardiac surgery: Are we moving in a right direction?&lt;/title&gt;&lt;secondary-title&gt;Annals of Cardiac Anaesthesia&lt;/secondary-title&gt;&lt;/titles&gt;&lt;periodical&gt;&lt;full-title&gt;Annals of Cardiac Anaesthesia&lt;/full-title&gt;&lt;/periodical&gt;&lt;pages&gt;489&lt;/pages&gt;&lt;volume&gt;19&lt;/volume&gt;&lt;number&gt;3&lt;/number&gt;&lt;dates&gt;&lt;year&gt;2016&lt;/year&gt;&lt;/dates&gt;&lt;urls&gt;&lt;/urls&gt;&lt;/record&gt;&lt;/Cite&gt;&lt;Cite&gt;&lt;Author&gt;Aston&lt;/Author&gt;&lt;Year&gt;2023&lt;/Year&gt;&lt;RecNum&gt;22&lt;/RecNum&gt;&lt;record&gt;&lt;rec-number&gt;22&lt;/rec-number&gt;&lt;foreign-keys&gt;&lt;key app="EN" db-id="sspsadtz5rexd3efdx2xftzep5a0tszvrest" timestamp="1787939265"&gt;22&lt;/key&gt;&lt;/foreign-keys&gt;&lt;ref-type name="Journal Article"&gt;17&lt;/ref-type&gt;&lt;contributors&gt;&lt;authors&gt;&lt;author&gt;Aston, Daniel&lt;/author&gt;&lt;author&gt;Zeloof, Daniel&lt;/author&gt;&lt;author&gt;Falter, Florian&lt;/author&gt;&lt;/authors&gt;&lt;/contributors&gt;&lt;titles&gt;&lt;title&gt;Anaesthesia for minimally invasive cardiac surgery&lt;/title&gt;&lt;secondary-title&gt;Journal of Cardiovascular Development and Disease&lt;/secondary-title&gt;&lt;/titles&gt;&lt;periodical&gt;&lt;full-title&gt;Journal of Cardiovascular Development and Disease&lt;/full-title&gt;&lt;/periodical&gt;&lt;pages&gt;462&lt;/pages&gt;&lt;volume&gt;10&lt;/volume&gt;&lt;number&gt;11&lt;/number&gt;&lt;dates&gt;&lt;year&gt;2023&lt;/year&gt;&lt;/dates&gt;&lt;isbn&gt;2308-3425&lt;/isbn&gt;&lt;urls&gt;&lt;/urls&gt;&lt;/record&gt;&lt;/Cite&gt;&lt;/EndNote&gt;</w:instrText>
+        <w:instrText xml:space="preserve"> ADDIN EN.CITE &lt;EndNote&gt;&lt;Cite&gt;&lt;Author&gt;Malik&lt;/Author&gt;&lt;Year&gt;2016&lt;/Year&gt;&lt;RecNum&gt;21&lt;/RecNum&gt;&lt;DisplayText&gt;[19, 20]&lt;/DisplayText&gt;&lt;record&gt;&lt;rec-number&gt;21&lt;/rec-number&gt;&lt;foreign-keys&gt;&lt;key app="EN" db-id="sspsadtz5rexd3efdx2xftzep5a0tszvrest" timestamp="1787939241"&gt;21&lt;/key&gt;&lt;/foreign-keys&gt;&lt;ref-type name="Journal Article"&gt;17&lt;/ref-type&gt;&lt;contributors&gt;&lt;authors&gt;&lt;author&gt;Malik, Vishwas&lt;/author&gt;&lt;author&gt;Jha, Ajay Kumar&lt;/author&gt;&lt;author&gt;Kapoor, Poonam Malhotra&lt;/author&gt;&lt;/authors&gt;&lt;/contributors&gt;&lt;titles&gt;&lt;title&gt;Anesthetic challenges in minimally invasive cardiac surgery: Are we moving in a right direction?&lt;/title&gt;&lt;secondary-title&gt;Annals of Cardiac Anaesthesia&lt;/secondary-title&gt;&lt;/titles&gt;&lt;periodical&gt;&lt;full-title&gt;Annals of Cardiac Anaesthesia&lt;/full-title&gt;&lt;/periodical&gt;&lt;pages&gt;489&lt;/pages&gt;&lt;volume&gt;19&lt;/volume&gt;&lt;number&gt;3&lt;/number&gt;&lt;dates&gt;&lt;year&gt;2016&lt;/year&gt;&lt;/dates&gt;&lt;urls&gt;&lt;/urls&gt;&lt;/record&gt;&lt;/Cite&gt;&lt;Cite&gt;&lt;Author&gt;Aston&lt;/Author&gt;&lt;Year&gt;2023&lt;/Year&gt;&lt;RecNum&gt;22&lt;/RecNum&gt;&lt;record&gt;&lt;rec-number&gt;22&lt;/rec-number&gt;&lt;foreign-keys&gt;&lt;key app="EN" db-id="sspsadtz5rexd3efdx2xftzep5a0tszvrest" timestamp="1787939265"&gt;22&lt;/key&gt;&lt;/foreign-keys&gt;&lt;ref-type name="Journal Article"&gt;17&lt;/ref-type&gt;&lt;contributors&gt;&lt;authors&gt;&lt;author&gt;Aston, Daniel&lt;/author&gt;&lt;author&gt;Zeloof, Daniel&lt;/author&gt;&lt;author&gt;Falter, Florian&lt;/author&gt;&lt;/authors&gt;&lt;/contributors&gt;&lt;titles&gt;&lt;title&gt;Anaesthesia for minimally invasive cardiac surgery&lt;/title&gt;&lt;secondary-title&gt;Journal of Cardiovascular Development and Disease&lt;/secondary-title&gt;&lt;/titles&gt;&lt;periodical&gt;&lt;full-title&gt;Journal of Cardiovascular Development and Disease&lt;/full-title&gt;&lt;/periodical&gt;&lt;pages&gt;462&lt;/pages&gt;&lt;volume&gt;10&lt;/volume&gt;&lt;number&gt;11&lt;/number&gt;&lt;dates&gt;&lt;year&gt;2023&lt;/year&gt;&lt;/dates&gt;&lt;isbn&gt;2308-3425&lt;/isbn&gt;&lt;urls&gt;&lt;/urls&gt;&lt;/record&gt;&lt;/Cite&gt;&lt;/EndNote&gt; </w:instrText>
       </w:r>
       <w:r>
         <w:rPr>
@@ -25185,7 +25105,7 @@
           <w:sz w:val="20"/>
           <w:szCs w:val="20"/>
         </w:rPr>
-        <w:instrText xml:space="preserve"> ADDIN EN.CITE &lt;EndNote&gt;&lt;Cite&gt;&lt;Author&gt;Aston&lt;/Author&gt;&lt;Year&gt;2023&lt;/Year&gt;&lt;RecNum&gt;22&lt;/RecNum&gt;&lt;DisplayText&gt;[17]&lt;/DisplayText&gt;&lt;record&gt;&lt;rec-number&gt;22&lt;/rec-number&gt;&lt;foreign-keys&gt;&lt;key app="EN" db-id="sspsadtz5rexd3efdx2xftzep5a0tszvrest" timestamp="1787939265"&gt;22&lt;/key&gt;&lt;/foreign-keys&gt;&lt;ref-type name="Journal Article"&gt;17&lt;/ref-type&gt;&lt;contributors&gt;&lt;authors&gt;&lt;author&gt;Aston, Daniel&lt;/author&gt;&lt;author&gt;Zeloof, Daniel&lt;/author&gt;&lt;author&gt;Falter, Florian&lt;/author&gt;&lt;/authors&gt;&lt;/contributors&gt;&lt;titles&gt;&lt;title&gt;Anaesthesia for minimally invasive cardiac surgery&lt;/title&gt;&lt;secondary-title&gt;Journal of Cardiovascular Development and Disease&lt;/secondary-title&gt;&lt;/titles&gt;&lt;periodical&gt;&lt;full-title&gt;Journal of Cardiovascular Development and Disease&lt;/full-title&gt;&lt;/periodical&gt;&lt;pages&gt;462&lt;/pages&gt;&lt;volume&gt;10&lt;/volume&gt;&lt;number&gt;11&lt;/number&gt;&lt;dates&gt;&lt;year&gt;2023&lt;/year&gt;&lt;/dates&gt;&lt;isbn&gt;2308-3425&lt;/isbn&gt;&lt;urls&gt;&lt;/urls&gt;&lt;/record&gt;&lt;/Cite&gt;&lt;/EndNote&gt;</w:instrText>
+        <w:instrText xml:space="preserve"> ADDIN EN.CITE &lt;EndNote&gt;&lt;Cite&gt;&lt;Author&gt;Aston&lt;/Author&gt;&lt;Year&gt;2023&lt;/Year&gt;&lt;RecNum&gt;22&lt;/RecNum&gt;&lt;DisplayText&gt;[20]&lt;/DisplayText&gt;&lt;record&gt;&lt;rec-number&gt;22&lt;/rec-number&gt;&lt;foreign-keys&gt;&lt;key app="EN" db-id="sspsadtz5rexd3efdx2xftzep5a0tszvrest" timestamp="1787939265"&gt;22&lt;/key&gt;&lt;/foreign-keys&gt;&lt;ref-type name="Journal Article"&gt;17&lt;/ref-type&gt;&lt;contributors&gt;&lt;authors&gt;&lt;author&gt;Aston, Daniel&lt;/author&gt;&lt;author&gt;Zeloof, Daniel&lt;/author&gt;&lt;author&gt;Falter, Florian&lt;/author&gt;&lt;/authors&gt;&lt;/contributors&gt;&lt;titles&gt;&lt;title&gt;Anaesthesia for minimally invasive cardiac surgery&lt;/title&gt;&lt;secondary-title&gt;Journal of Cardiovascular Development and Disease&lt;/secondary-title&gt;&lt;/titles&gt;&lt;periodical&gt;&lt;full-title&gt;Journal of Cardiovascular Development and Disease&lt;/full-title&gt;&lt;/periodical&gt;&lt;pages&gt;462&lt;/pages&gt;&lt;volume&gt;10&lt;/volume&gt;&lt;number&gt;11&lt;/number&gt;&lt;dates&gt;&lt;year&gt;2023&lt;/year&gt;&lt;/dates&gt;&lt;isbn&gt;2308-3425&lt;/isbn&gt;&lt;urls&gt;&lt;/urls&gt;&lt;/record&gt;&lt;/Cite&gt;&lt;/EndNote&gt; </w:instrText>
       </w:r>
       <w:r>
         <w:rPr>
@@ -25373,48 +25293,7 @@
           <w:szCs w:val="20"/>
         </w:rPr>
         <w:fldChar w:fldCharType="begin">
-          <w:fldData xml:space="preserve">PEVuZE5vdGU+PENpdGU+PEF1dGhvcj5KaWFuZzwvQXV0aG9yPjxZZWFyPjIwMjQ8L1llYXI+PFJl
-Y051bT4xODwvUmVjTnVtPjxEaXNwbGF5VGV4dD5bMTBdPC9EaXNwbGF5VGV4dD48cmVjb3JkPjxy
-ZWMtbnVtYmVyPjE4PC9yZWMtbnVtYmVyPjxmb3JlaWduLWtleXM+PGtleSBhcHA9IkVOIiBkYi1p
-ZD0ic3Nwc2FkdHo1cmV4ZDNlZmR4MnhmdHplcDVhMHRzenZyZXN0IiB0aW1lc3RhbXA9IjE3ODc5
-Mzg0NzAiPjE4PC9rZXk+PC9mb3JlaWduLWtleXM+PHJlZi10eXBlIG5hbWU9IkpvdXJuYWwgQXJ0
-aWNsZSI+MTc8L3JlZi10eXBlPjxjb250cmlidXRvcnM+PGF1dGhvcnM+PGF1dGhvcj5KaWFuZywg
-VC48L2F1dGhvcj48YXV0aG9yPldhbmcsIEwuIFguPC9hdXRob3I+PGF1dGhvcj5UZW5nLCBILiBL
-LjwvYXV0aG9yPjxhdXRob3I+WHUsIEwuIFQuPC9hdXRob3I+PGF1dGhvcj5Mb3UsIFguIEsuPC9h
-dXRob3I+PGF1dGhvcj5XYW5nLCBZLjwvYXV0aG9yPjxhdXRob3I+V2VpLCBILiBXLjwvYXV0aG9y
-PjxhdXRob3I+WWFuLCBNLiBKLjwvYXV0aG9yPjwvYXV0aG9ycz48L2NvbnRyaWJ1dG9ycz48YXV0
-aC1hZGRyZXNzPlJlaGFiaWxpdGF0aW9uIE1lZGljaW5lIENlbnRlciwgRGVwYXJ0bWVudCBvZiBB
-bmVzdGhlc2lvbG9neSwgWmhlamlhbmcgUHJvdmluY2lhbCBQZW9wbGUmYXBvcztzIEhvc3BpdGFs
-LCBBZmZpbGlhdGVkIFBlb3BsZSZhcG9zO3MgSG9zcGl0YWwsIEhhbmd6aG91IE1lZGljYWwgQ29s
-bGVnZSwgV2FubmFuIE1lZGljYWwgQ29sbGVnZSBHcmFkdWF0ZSBUcmFpbmluZyBCYXNlLCBIYW5n
-emhvdSwgQ2hpbmEuJiN4RDtTY2hvb2wgb2YgR3JhZHVhdGUsIEppbnpob3UgTWVkaWNhbCBVbml2
-ZXJzaXR5LCBKaW56aG91LCBDaGluYS4mI3hEO1JlaGFiaWxpdGF0aW9uIE1lZGljaW5lIENlbnRl
-ciwgRGVwYXJ0bWVudCBvZiBBbmVzdGhlc2lvbG9neSwgWmhlamlhbmcgUHJvdmluY2lhbCBQZW9w
-bGUmYXBvcztzIEhvc3BpdGFsLCBBZmZpbGlhdGVkIFBlb3BsZSZhcG9zO3MgSG9zcGl0YWwsIEhh
-bmd6aG91IE1lZGljYWwgQ29sbGVnZSwgSGFuZ3pob3UsIENoaW5hLjwvYXV0aC1hZGRyZXNzPjx0
-aXRsZXM+PHRpdGxlPlVsdHJhLWZhc3QtdHJhY2sgY2FyZGlhYyBhbmVzdGhlc2lhIGluIG1pbmlt
-YWxseSBpbnZhc2l2ZSBjYXJkaWFjIHN1cmdlcnk6IGEgcmV0cm9zcGVjdGl2ZSBvYnNlcnZhdGlv
-bmFsIHN0dWR5PC90aXRsZT48c2Vjb25kYXJ5LXRpdGxlPkNhcmRpb3Zhc2MgRGlhZ24gVGhlcjwv
-c2Vjb25kYXJ5LXRpdGxlPjwvdGl0bGVzPjxwZXJpb2RpY2FsPjxmdWxsLXRpdGxlPkNhcmRpb3Zh
-c2MgRGlhZ24gVGhlcjwvZnVsbC10aXRsZT48L3BlcmlvZGljYWw+PHBhZ2VzPjc0MC03NTI8L3Bh
-Z2VzPjx2b2x1bWU+MTQ8L3ZvbHVtZT48bnVtYmVyPjU8L251bWJlcj48ZWRpdGlvbj4yMDI0MTAy
-MjwvZWRpdGlvbj48a2V5d29yZHM+PGtleXdvcmQ+QWx2ZW9sYXItYXJ0ZXJpYWwgb3h5Z2VuIHRl
-bnNpb24gZGlmZmVyZW5jZTwva2V5d29yZD48a2V5d29yZD5taW5pbWFsbHkgaW52YXNpdmUgY2Fy
-ZGlhYyBzdXJnZXJ5IChNSUNTKTwva2V5d29yZD48a2V5d29yZD5veHlnZW5hdGlvbiBpbmRleDwv
-a2V5d29yZD48a2V5d29yZD5yZXNwaXJhdG9yeSBpbmRleDwva2V5d29yZD48a2V5d29yZD51bHRy
-YS1mYXN0LXRyYWNrIGNhcmRpYWMgYW5lc3RoZXNpYSAoVUZUQ0EpPC9rZXl3b3JkPjwva2V5d29y
-ZHM+PGRhdGVzPjx5ZWFyPjIwMjQ8L3llYXI+PHB1Yi1kYXRlcz48ZGF0ZT5PY3QgMzE8L2RhdGU+
-PC9wdWItZGF0ZXM+PC9kYXRlcz48aXNibj4yMjIzLTM2NTIgKFByaW50KSYjeEQ7MjIyMy0zNjUy
-PC9pc2JuPjxhY2Nlc3Npb24tbnVtPjM5NTEzMTQ0PC9hY2Nlc3Npb24tbnVtPjx1cmxzPjwvdXJs
-cz48Y3VzdG9tMT5Db25mbGljdHMgb2YgSW50ZXJlc3Q6IEFsbCBhdXRob3JzIGhhdmUgY29tcGxl
-dGVkIHRoZSBJQ01KRSB1bmlmb3JtIGRpc2Nsb3N1cmUgZm9ybSAoYXZhaWxhYmxlIGF0IGh0dHBz
-Oi8vY2R0LmFtZWdyb3Vwcy5jb20vYXJ0aWNsZS92aWV3LzEwLjIxMDM3L2NkdC0yNC0xNzUvY29p
-ZikuIFRoZSBhdXRob3JzIGhhdmUgbm8gY29uZmxpY3RzIG9mIGludGVyZXN0IHRvIGRlY2xhcmUu
-PC9jdXN0b20xPjxjdXN0b20yPlBNQzExNTM4ODMwPC9jdXN0b20yPjxlbGVjdHJvbmljLXJlc291
-cmNlLW51bT4xMC4yMTAzNy9jZHQtMjQtMTc1PC9lbGVjdHJvbmljLXJlc291cmNlLW51bT48cmVt
-b3RlLWRhdGFiYXNlLXByb3ZpZGVyPk5MTTwvcmVtb3RlLWRhdGFiYXNlLXByb3ZpZGVyPjxsYW5n
-dWFnZT5lbmc8L2xhbmd1YWdlPjwvcmVjb3JkPjwvQ2l0ZT48L0VuZE5vdGU+AG==
-</w:fldData>
+          <w:fldData xml:space="preserve">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</w:fldData>
         </w:fldChar>
       </w:r>
       <w:r>
@@ -25434,48 +25313,7 @@
           <w:szCs w:val="20"/>
         </w:rPr>
         <w:fldChar w:fldCharType="begin">
-          <w:fldData xml:space="preserve">PEVuZE5vdGU+PENpdGU+PEF1dGhvcj5KaWFuZzwvQXV0aG9yPjxZZWFyPjIwMjQ8L1llYXI+PFJl
-Y051bT4xODwvUmVjTnVtPjxEaXNwbGF5VGV4dD5bMTBdPC9EaXNwbGF5VGV4dD48cmVjb3JkPjxy
-ZWMtbnVtYmVyPjE4PC9yZWMtbnVtYmVyPjxmb3JlaWduLWtleXM+PGtleSBhcHA9IkVOIiBkYi1p
-ZD0ic3Nwc2FkdHo1cmV4ZDNlZmR4MnhmdHplcDVhMHRzenZyZXN0IiB0aW1lc3RhbXA9IjE3ODc5
-Mzg0NzAiPjE4PC9rZXk+PC9mb3JlaWduLWtleXM+PHJlZi10eXBlIG5hbWU9IkpvdXJuYWwgQXJ0
-aWNsZSI+MTc8L3JlZi10eXBlPjxjb250cmlidXRvcnM+PGF1dGhvcnM+PGF1dGhvcj5KaWFuZywg
-VC48L2F1dGhvcj48YXV0aG9yPldhbmcsIEwuIFguPC9hdXRob3I+PGF1dGhvcj5UZW5nLCBILiBL
-LjwvYXV0aG9yPjxhdXRob3I+WHUsIEwuIFQuPC9hdXRob3I+PGF1dGhvcj5Mb3UsIFguIEsuPC9h
-dXRob3I+PGF1dGhvcj5XYW5nLCBZLjwvYXV0aG9yPjxhdXRob3I+V2VpLCBILiBXLjwvYXV0aG9y
-PjxhdXRob3I+WWFuLCBNLiBKLjwvYXV0aG9yPjwvYXV0aG9ycz48L2NvbnRyaWJ1dG9ycz48YXV0
-aC1hZGRyZXNzPlJlaGFiaWxpdGF0aW9uIE1lZGljaW5lIENlbnRlciwgRGVwYXJ0bWVudCBvZiBB
-bmVzdGhlc2lvbG9neSwgWmhlamlhbmcgUHJvdmluY2lhbCBQZW9wbGUmYXBvcztzIEhvc3BpdGFs
-LCBBZmZpbGlhdGVkIFBlb3BsZSZhcG9zO3MgSG9zcGl0YWwsIEhhbmd6aG91IE1lZGljYWwgQ29s
-bGVnZSwgV2FubmFuIE1lZGljYWwgQ29sbGVnZSBHcmFkdWF0ZSBUcmFpbmluZyBCYXNlLCBIYW5n
-emhvdSwgQ2hpbmEuJiN4RDtTY2hvb2wgb2YgR3JhZHVhdGUsIEppbnpob3UgTWVkaWNhbCBVbml2
-ZXJzaXR5LCBKaW56aG91LCBDaGluYS4mI3hEO1JlaGFiaWxpdGF0aW9uIE1lZGljaW5lIENlbnRl
-ciwgRGVwYXJ0bWVudCBvZiBBbmVzdGhlc2lvbG9neSwgWmhlamlhbmcgUHJvdmluY2lhbCBQZW9w
-bGUmYXBvcztzIEhvc3BpdGFsLCBBZmZpbGlhdGVkIFBlb3BsZSZhcG9zO3MgSG9zcGl0YWwsIEhh
-bmd6aG91IE1lZGljYWwgQ29sbGVnZSwgSGFuZ3pob3UsIENoaW5hLjwvYXV0aC1hZGRyZXNzPjx0
-aXRsZXM+PHRpdGxlPlVsdHJhLWZhc3QtdHJhY2sgY2FyZGlhYyBhbmVzdGhlc2lhIGluIG1pbmlt
-YWxseSBpbnZhc2l2ZSBjYXJkaWFjIHN1cmdlcnk6IGEgcmV0cm9zcGVjdGl2ZSBvYnNlcnZhdGlv
-bmFsIHN0dWR5PC90aXRsZT48c2Vjb25kYXJ5LXRpdGxlPkNhcmRpb3Zhc2MgRGlhZ24gVGhlcjwv
-c2Vjb25kYXJ5LXRpdGxlPjwvdGl0bGVzPjxwZXJpb2RpY2FsPjxmdWxsLXRpdGxlPkNhcmRpb3Zh
-c2MgRGlhZ24gVGhlcjwvZnVsbC10aXRsZT48L3BlcmlvZGljYWw+PHBhZ2VzPjc0MC03NTI8L3Bh
-Z2VzPjx2b2x1bWU+MTQ8L3ZvbHVtZT48bnVtYmVyPjU8L251bWJlcj48ZWRpdGlvbj4yMDI0MTAy
-MjwvZWRpdGlvbj48a2V5d29yZHM+PGtleXdvcmQ+QWx2ZW9sYXItYXJ0ZXJpYWwgb3h5Z2VuIHRl
-bnNpb24gZGlmZmVyZW5jZTwva2V5d29yZD48a2V5d29yZD5taW5pbWFsbHkgaW52YXNpdmUgY2Fy
-ZGlhYyBzdXJnZXJ5IChNSUNTKTwva2V5d29yZD48a2V5d29yZD5veHlnZW5hdGlvbiBpbmRleDwv
-a2V5d29yZD48a2V5d29yZD5yZXNwaXJhdG9yeSBpbmRleDwva2V5d29yZD48a2V5d29yZD51bHRy
-YS1mYXN0LXRyYWNrIGNhcmRpYWMgYW5lc3RoZXNpYSAoVUZUQ0EpPC9rZXl3b3JkPjwva2V5d29y
-ZHM+PGRhdGVzPjx5ZWFyPjIwMjQ8L3llYXI+PHB1Yi1kYXRlcz48ZGF0ZT5PY3QgMzE8L2RhdGU+
-PC9wdWItZGF0ZXM+PC9kYXRlcz48aXNibj4yMjIzLTM2NTIgKFByaW50KSYjeEQ7MjIyMy0zNjUy
-PC9pc2JuPjxhY2Nlc3Npb24tbnVtPjM5NTEzMTQ0PC9hY2Nlc3Npb24tbnVtPjx1cmxzPjwvdXJs
-cz48Y3VzdG9tMT5Db25mbGljdHMgb2YgSW50ZXJlc3Q6IEFsbCBhdXRob3JzIGhhdmUgY29tcGxl
-dGVkIHRoZSBJQ01KRSB1bmlmb3JtIGRpc2Nsb3N1cmUgZm9ybSAoYXZhaWxhYmxlIGF0IGh0dHBz
-Oi8vY2R0LmFtZWdyb3Vwcy5jb20vYXJ0aWNsZS92aWV3LzEwLjIxMDM3L2NkdC0yNC0xNzUvY29p
-ZikuIFRoZSBhdXRob3JzIGhhdmUgbm8gY29uZmxpY3RzIG9mIGludGVyZXN0IHRvIGRlY2xhcmUu
-PC9jdXN0b20xPjxjdXN0b20yPlBNQzExNTM4ODMwPC9jdXN0b20yPjxlbGVjdHJvbmljLXJlc291
-cmNlLW51bT4xMC4yMTAzNy9jZHQtMjQtMTc1PC9lbGVjdHJvbmljLXJlc291cmNlLW51bT48cmVt
-b3RlLWRhdGFiYXNlLXByb3ZpZGVyPk5MTTwvcmVtb3RlLWRhdGFiYXNlLXByb3ZpZGVyPjxsYW5n
-dWFnZT5lbmc8L2xhbmd1YWdlPjwvcmVjb3JkPjwvQ2l0ZT48L0VuZE5vdGU+AG==
-</w:fldData>
+          <w:fldData xml:space="preserve">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</w:fldData>
         </w:fldChar>
       </w:r>
       <w:r>
@@ -26164,7 +26002,7 @@
           <w:sz w:val="20"/>
           <w:szCs w:val="20"/>
         </w:rPr>
-        <w:instrText xml:space="preserve"> ADDIN EN.CITE &lt;EndNote&gt;&lt;Cite&gt;&lt;Author&gt;Aston&lt;/Author&gt;&lt;Year&gt;2023&lt;/Year&gt;&lt;RecNum&gt;22&lt;/RecNum&gt;&lt;DisplayText&gt;[17]&lt;/DisplayText&gt;&lt;record&gt;&lt;rec-number&gt;22&lt;/rec-number&gt;&lt;foreign-keys&gt;&lt;key app="EN" db-id="sspsadtz5rexd3efdx2xftzep5a0tszvrest" timestamp="1787939265"&gt;22&lt;/key&gt;&lt;/foreign-keys&gt;&lt;ref-type name="Journal Article"&gt;17&lt;/ref-type&gt;&lt;contributors&gt;&lt;authors&gt;&lt;author&gt;Aston, Daniel&lt;/author&gt;&lt;author&gt;Zeloof, Daniel&lt;/author&gt;&lt;author&gt;Falter, Florian&lt;/author&gt;&lt;/authors&gt;&lt;/contributors&gt;&lt;titles&gt;&lt;title&gt;Anaesthesia for minimally invasive cardiac surgery&lt;/title&gt;&lt;secondary-title&gt;Journal of Cardiovascular Development and Disease&lt;/secondary-title&gt;&lt;/titles&gt;&lt;periodical&gt;&lt;full-title&gt;Journal of Cardiovascular Development and Disease&lt;/full-title&gt;&lt;/periodical&gt;&lt;pages&gt;462&lt;/pages&gt;&lt;volume&gt;10&lt;/volume&gt;&lt;number&gt;11&lt;/number&gt;&lt;dates&gt;&lt;year&gt;2023&lt;/year&gt;&lt;/dates&gt;&lt;isbn&gt;2308-3425&lt;/isbn&gt;&lt;urls&gt;&lt;/urls&gt;&lt;/record&gt;&lt;/Cite&gt;&lt;/EndNote&gt;</w:instrText>
+        <w:instrText xml:space="preserve"> ADDIN EN.CITE &lt;EndNote&gt;&lt;Cite&gt;&lt;Author&gt;Aston&lt;/Author&gt;&lt;Year&gt;2023&lt;/Year&gt;&lt;RecNum&gt;22&lt;/RecNum&gt;&lt;DisplayText&gt;[20]&lt;/DisplayText&gt;&lt;record&gt;&lt;rec-number&gt;22&lt;/rec-number&gt;&lt;foreign-keys&gt;&lt;key app="EN" db-id="sspsadtz5rexd3efdx2xftzep5a0tszvrest" timestamp="1787939265"&gt;22&lt;/key&gt;&lt;/foreign-keys&gt;&lt;ref-type name="Journal Article"&gt;17&lt;/ref-type&gt;&lt;contributors&gt;&lt;authors&gt;&lt;author&gt;Aston, Daniel&lt;/author&gt;&lt;author&gt;Zeloof, Daniel&lt;/author&gt;&lt;author&gt;Falter, Florian&lt;/author&gt;&lt;/authors&gt;&lt;/contributors&gt;&lt;titles&gt;&lt;title&gt;Anaesthesia for minimally invasive cardiac surgery&lt;/title&gt;&lt;secondary-title&gt;Journal of Cardiovascular Development and Disease&lt;/secondary-title&gt;&lt;/titles&gt;&lt;periodical&gt;&lt;full-title&gt;Journal of Cardiovascular Development and Disease&lt;/full-title&gt;&lt;/periodical&gt;&lt;pages&gt;462&lt;/pages&gt;&lt;volume&gt;10&lt;/volume&gt;&lt;number&gt;11&lt;/number&gt;&lt;dates&gt;&lt;year&gt;2023&lt;/year&gt;&lt;/dates&gt;&lt;isbn&gt;2308-3425&lt;/isbn&gt;&lt;urls&gt;&lt;/urls&gt;&lt;/record&gt;&lt;/Cite&gt;&lt;/EndNote&gt; </w:instrText>
       </w:r>
       <w:r>
         <w:rPr>
@@ -27704,7 +27542,7 @@
           <w:sz w:val="20"/>
           <w:szCs w:val="20"/>
         </w:rPr>
-        <w:instrText xml:space="preserve"> ADDIN EN.CITE &lt;EndNote&gt;&lt;Cite&gt;&lt;Author&gt;Demir&lt;/Author&gt;&lt;Year&gt;2025&lt;/Year&gt;&lt;RecNum&gt;17&lt;/RecNum&gt;&lt;DisplayText&gt;[9, 17]&lt;/DisplayText&gt;&lt;record&gt;&lt;rec-number&gt;17&lt;/rec-number&gt;&lt;foreign-keys&gt;&lt;key app="EN" db-id="sspsadtz5rexd3efdx2xftzep5a0tszvrest" timestamp="1787938345"&gt;17&lt;/key&gt;&lt;/foreign-keys&gt;&lt;ref-type name="Journal Article"&gt;17&lt;/ref-type&gt;&lt;contributors&gt;&lt;authors&gt;&lt;author&gt;Demir, Zeliha Aslı&lt;/author&gt;&lt;author&gt;Mavioğlu, Hayrettin Levent&lt;/author&gt;&lt;/authors&gt;&lt;/contributors&gt;&lt;titles&gt;&lt;title&gt;Anesthesia Management in Minimally Invasive Cardiac Surgery: A Comprehensive Protocol&lt;/title&gt;&lt;secondary-title&gt;GKD Anest Yoğ Bak Dern Derg&lt;/secondary-title&gt;&lt;/titles&gt;&lt;periodical&gt;&lt;full-title&gt;GKD Anest Yoğ Bak Dern Derg&lt;/full-title&gt;&lt;/periodical&gt;&lt;pages&gt;63-70&lt;/pages&gt;&lt;volume&gt;31&lt;/volume&gt;&lt;number&gt;2&lt;/number&gt;&lt;dates&gt;&lt;year&gt;2025&lt;/year&gt;&lt;/dates&gt;&lt;urls&gt;&lt;related-urls&gt;&lt;url&gt;https://dx.doi.org/10.14744/GKDAD.2025.78790&lt;/url&gt;&lt;/related-urls&gt;&lt;/urls&gt;&lt;electronic-resource-num&gt;10.14744/gkdad.2025.78790&lt;/electronic-resource-num&gt;&lt;/record&gt;&lt;/Cite&gt;&lt;Cite&gt;&lt;Author&gt;Aston&lt;/Author&gt;&lt;Year&gt;2023&lt;/Year&gt;&lt;RecNum&gt;22&lt;/RecNum&gt;&lt;record&gt;&lt;rec-number&gt;22&lt;/rec-number&gt;&lt;foreign-keys&gt;&lt;key app="EN" db-id="sspsadtz5rexd3efdx2xftzep5a0tszvrest" timestamp="1787939265"&gt;22&lt;/key&gt;&lt;/foreign-keys&gt;&lt;ref-type name="Journal Article"&gt;17&lt;/ref-type&gt;&lt;contributors&gt;&lt;authors&gt;&lt;author&gt;Aston, Daniel&lt;/author&gt;&lt;author&gt;Zeloof, Daniel&lt;/author&gt;&lt;author&gt;Falter, Florian&lt;/author&gt;&lt;/authors&gt;&lt;/contributors&gt;&lt;titles&gt;&lt;title&gt;Anaesthesia for minimally invasive cardiac surgery&lt;/title&gt;&lt;secondary-title&gt;Journal of Cardiovascular Development and Disease&lt;/secondary-title&gt;&lt;/titles&gt;&lt;periodical&gt;&lt;full-title&gt;Journal of Cardiovascular Development and Disease&lt;/full-title&gt;&lt;/periodical&gt;&lt;pages&gt;462&lt;/pages&gt;&lt;volume&gt;10&lt;/volume&gt;&lt;number&gt;11&lt;/number&gt;&lt;dates&gt;&lt;year&gt;2023&lt;/year&gt;&lt;/dates&gt;&lt;isbn&gt;2308-3425&lt;/isbn&gt;&lt;urls&gt;&lt;/urls&gt;&lt;/record&gt;&lt;/Cite&gt;&lt;/EndNote&gt;</w:instrText>
+        <w:instrText xml:space="preserve"> ADDIN EN.CITE &lt;EndNote&gt;&lt;Cite&gt;&lt;Author&gt;Demir&lt;/Author&gt;&lt;Year&gt;2025&lt;/Year&gt;&lt;RecNum&gt;17&lt;/RecNum&gt;&lt;DisplayText&gt;[12, 20]&lt;/DisplayText&gt;&lt;record&gt;&lt;rec-number&gt;17&lt;/rec-number&gt;&lt;foreign-keys&gt;&lt;key app="EN" db-id="sspsadtz5rexd3efdx2xftzep5a0tszvrest" timestamp="1787938345"&gt;17&lt;/key&gt;&lt;/foreign-keys&gt;&lt;ref-type name="Journal Article"&gt;17&lt;/ref-type&gt;&lt;contributors&gt;&lt;authors&gt;&lt;author&gt;Demir, Zeliha Aslı&lt;/author&gt;&lt;author&gt;Mavioğlu, Hayrettin Levent&lt;/author&gt;&lt;/authors&gt;&lt;/contributors&gt;&lt;titles&gt;&lt;title&gt;Anesthesia Management in Minimally Invasive Cardiac Surgery: A Comprehensive Protocol&lt;/title&gt;&lt;secondary-title&gt;GKD Anest Yoğ Bak Dern Derg&lt;/secondary-title&gt;&lt;/titles&gt;&lt;periodical&gt;&lt;full-title&gt;GKD Anest Yoğ Bak Dern Derg&lt;/full-title&gt;&lt;/periodical&gt;&lt;pages&gt;63-70&lt;/pages&gt;&lt;volume&gt;31&lt;/volume&gt;&lt;number&gt;2&lt;/number&gt;&lt;dates&gt;&lt;year&gt;2025&lt;/year&gt;&lt;/dates&gt;&lt;urls&gt;&lt;related-urls&gt;&lt;url&gt;https://dx.doi.org/10.14744/GKDAD.2025.78790&lt;/url&gt;&lt;/related-urls&gt;&lt;/urls&gt;&lt;electronic-resource-num&gt;10.14744/gkdad.2025.78790&lt;/electronic-resource-num&gt;&lt;/record&gt;&lt;/Cite&gt;&lt;Cite&gt;&lt;Author&gt;Aston&lt;/Author&gt;&lt;Year&gt;2023&lt;/Year&gt;&lt;RecNum&gt;22&lt;/RecNum&gt;&lt;record&gt;&lt;rec-number&gt;22&lt;/rec-number&gt;&lt;foreign-keys&gt;&lt;key app="EN" db-id="sspsadtz5rexd3efdx2xftzep5a0tszvrest" timestamp="1787939265"&gt;22&lt;/key&gt;&lt;/foreign-keys&gt;&lt;ref-type name="Journal Article"&gt;17&lt;/ref-type&gt;&lt;contributors&gt;&lt;authors&gt;&lt;author&gt;Aston, Daniel&lt;/author&gt;&lt;author&gt;Zeloof, Daniel&lt;/author&gt;&lt;author&gt;Falter, Florian&lt;/author&gt;&lt;/authors&gt;&lt;/contributors&gt;&lt;titles&gt;&lt;title&gt;Anaesthesia for minimally invasive cardiac surgery&lt;/title&gt;&lt;secondary-title&gt;Journal of Cardiovascular Development and Disease&lt;/secondary-title&gt;&lt;/titles&gt;&lt;periodical&gt;&lt;full-title&gt;Journal of Cardiovascular Development and Disease&lt;/full-title&gt;&lt;/periodical&gt;&lt;pages&gt;462&lt;/pages&gt;&lt;volume&gt;10&lt;/volume&gt;&lt;number&gt;11&lt;/number&gt;&lt;dates&gt;&lt;year&gt;2023&lt;/year&gt;&lt;/dates&gt;&lt;isbn&gt;2308-3425&lt;/isbn&gt;&lt;urls&gt;&lt;/urls&gt;&lt;/record&gt;&lt;/Cite&gt;&lt;/EndNote&gt; </w:instrText>
       </w:r>
       <w:r>
         <w:rPr>
@@ -28320,7 +28158,7 @@
           <w:sz w:val="20"/>
           <w:szCs w:val="20"/>
         </w:rPr>
-        <w:instrText xml:space="preserve"> ADDIN EN.CITE &lt;EndNote&gt;&lt;Cite&gt;&lt;Author&gt;Aquilina&lt;/Author&gt;&lt;Year&gt;2025&lt;/Year&gt;&lt;RecNum&gt;23&lt;/RecNum&gt;&lt;DisplayText&gt;[18]&lt;/DisplayText&gt;&lt;record&gt;&lt;rec-number&gt;23&lt;/rec-number&gt;&lt;foreign-keys&gt;&lt;key app="EN" db-id="sspsadtz5rexd3efdx2xftzep5a0tszvrest" timestamp="1787939531"&gt;23&lt;/key&gt;&lt;/foreign-keys&gt;&lt;ref-type name="Journal Article"&gt;17&lt;/ref-type&gt;&lt;contributors&gt;&lt;authors&gt;&lt;author&gt;Aquilina, Julia&lt;/author&gt;&lt;author&gt;Fournier, Emilie&lt;/author&gt;&lt;author&gt;Matteucci, Matteo&lt;/author&gt;&lt;author&gt;Beffi, Manuel&lt;/author&gt;&lt;author&gt;Musazzi, Andrea&lt;/author&gt;&lt;author&gt;Severgnini, Paolo&lt;/author&gt;&lt;/authors&gt;&lt;/contributors&gt;&lt;titles&gt;&lt;title&gt;Differential hypoxemia during peripheral cardiopulmonary bypass&lt;/title&gt;&lt;secondary-title&gt;Perfusion&lt;/secondary-title&gt;&lt;/titles&gt;&lt;periodical&gt;&lt;full-title&gt;Perfusion&lt;/full-title&gt;&lt;/periodical&gt;&lt;pages&gt;1291-1293&lt;/pages&gt;&lt;volume&gt;40&lt;/volume&gt;&lt;number&gt;5&lt;/number&gt;&lt;dates&gt;&lt;year&gt;2025&lt;/year&gt;&lt;/dates&gt;&lt;isbn&gt;0267-6591&lt;/isbn&gt;&lt;urls&gt;&lt;/urls&gt;&lt;/record&gt;&lt;/Cite&gt;&lt;/EndNote&gt;</w:instrText>
+        <w:instrText xml:space="preserve"> ADDIN EN.CITE &lt;EndNote&gt;&lt;Cite&gt;&lt;Author&gt;Aquilina&lt;/Author&gt;&lt;Year&gt;2025&lt;/Year&gt;&lt;RecNum&gt;23&lt;/RecNum&gt;&lt;DisplayText&gt;[21]&lt;/DisplayText&gt;&lt;record&gt;&lt;rec-number&gt;23&lt;/rec-number&gt;&lt;foreign-keys&gt;&lt;key app="EN" db-id="sspsadtz5rexd3efdx2xftzep5a0tszvrest" timestamp="1787939531"&gt;23&lt;/key&gt;&lt;/foreign-keys&gt;&lt;ref-type name="Journal Article"&gt;17&lt;/ref-type&gt;&lt;contributors&gt;&lt;authors&gt;&lt;author&gt;Aquilina, Julia&lt;/author&gt;&lt;author&gt;Fournier, Emilie&lt;/author&gt;&lt;author&gt;Matteucci, Matteo&lt;/author&gt;&lt;author&gt;Beffi, Manuel&lt;/author&gt;&lt;author&gt;Musazzi, Andrea&lt;/author&gt;&lt;author&gt;Severgnini, Paolo&lt;/author&gt;&lt;/authors&gt;&lt;/contributors&gt;&lt;titles&gt;&lt;title&gt;Differential hypoxemia during peripheral cardiopulmonary bypass&lt;/title&gt;&lt;secondary-title&gt;Perfusion&lt;/secondary-title&gt;&lt;/titles&gt;&lt;periodical&gt;&lt;full-title&gt;Perfusion&lt;/full-title&gt;&lt;/periodical&gt;&lt;pages&gt;1291-1293&lt;/pages&gt;&lt;volume&gt;40&lt;/volume&gt;&lt;number&gt;5&lt;/number&gt;&lt;dates&gt;&lt;year&gt;2025&lt;/year&gt;&lt;/dates&gt;&lt;isbn&gt;0267-6591&lt;/isbn&gt;&lt;urls&gt;&lt;/urls&gt;&lt;/record&gt;&lt;/Cite&gt;&lt;/EndNote&gt; </w:instrText>
       </w:r>
       <w:r>
         <w:rPr>
@@ -28956,7 +28794,7 @@
           <w:sz w:val="20"/>
           <w:szCs w:val="20"/>
         </w:rPr>
-        <w:instrText xml:space="preserve"> ADDIN EN.CITE &lt;EndNote&gt;&lt;Cite&gt;&lt;Author&gt;Demir&lt;/Author&gt;&lt;Year&gt;2025&lt;/Year&gt;&lt;RecNum&gt;17&lt;/RecNum&gt;&lt;DisplayText&gt;[9]&lt;/DisplayText&gt;&lt;record&gt;&lt;rec-number&gt;17&lt;/rec-number&gt;&lt;foreign-keys&gt;&lt;key app="EN" db-id="sspsadtz5rexd3efdx2xftzep5a0tszvrest" timestamp="1787938345"&gt;17&lt;/key&gt;&lt;/foreign-keys&gt;&lt;ref-type name="Journal Article"&gt;17&lt;/ref-type&gt;&lt;contributors&gt;&lt;authors&gt;&lt;author&gt;Demir, Zeliha Aslı&lt;/author&gt;&lt;author&gt;Mavioğlu, Hayrettin Levent&lt;/author&gt;&lt;/authors&gt;&lt;/contributors&gt;&lt;titles&gt;&lt;title&gt;Anesthesia Management in Minimally Invasive Cardiac Surgery: A Comprehensive Protocol&lt;/title&gt;&lt;secondary-title&gt;GKD Anest Yoğ Bak Dern Derg&lt;/secondary-title&gt;&lt;/titles&gt;&lt;periodical&gt;&lt;full-title&gt;GKD Anest Yoğ Bak Dern Derg&lt;/full-title&gt;&lt;/periodical&gt;&lt;pages&gt;63-70&lt;/pages&gt;&lt;volume&gt;31&lt;/volume&gt;&lt;number&gt;2&lt;/number&gt;&lt;dates&gt;&lt;year&gt;2025&lt;/year&gt;&lt;/dates&gt;&lt;urls&gt;&lt;related-urls&gt;&lt;url&gt;https://dx.doi.org/10.14744/GKDAD.2025.78790&lt;/url&gt;&lt;/related-urls&gt;&lt;/urls&gt;&lt;electronic-resource-num&gt;10.14744/gkdad.2025.78790&lt;/electronic-resource-num&gt;&lt;/record&gt;&lt;/Cite&gt;&lt;/EndNote&gt;</w:instrText>
+        <w:instrText xml:space="preserve"> ADDIN EN.CITE &lt;EndNote&gt;&lt;Cite&gt;&lt;Author&gt;Demir&lt;/Author&gt;&lt;Year&gt;2025&lt;/Year&gt;&lt;RecNum&gt;17&lt;/RecNum&gt;&lt;DisplayText&gt;[12]&lt;/DisplayText&gt;&lt;record&gt;&lt;rec-number&gt;17&lt;/rec-number&gt;&lt;foreign-keys&gt;&lt;key app="EN" db-id="sspsadtz5rexd3efdx2xftzep5a0tszvrest" timestamp="1787938345"&gt;17&lt;/key&gt;&lt;/foreign-keys&gt;&lt;ref-type name="Journal Article"&gt;17&lt;/ref-type&gt;&lt;contributors&gt;&lt;authors&gt;&lt;author&gt;Demir, Zeliha Aslı&lt;/author&gt;&lt;author&gt;Mavioğlu, Hayrettin Levent&lt;/author&gt;&lt;/authors&gt;&lt;/contributors&gt;&lt;titles&gt;&lt;title&gt;Anesthesia Management in Minimally Invasive Cardiac Surgery: A Comprehensive Protocol&lt;/title&gt;&lt;secondary-title&gt;GKD Anest Yoğ Bak Dern Derg&lt;/secondary-title&gt;&lt;/titles&gt;&lt;periodical&gt;&lt;full-title&gt;GKD Anest Yoğ Bak Dern Derg&lt;/full-title&gt;&lt;/periodical&gt;&lt;pages&gt;63-70&lt;/pages&gt;&lt;volume&gt;31&lt;/volume&gt;&lt;number&gt;2&lt;/number&gt;&lt;dates&gt;&lt;year&gt;2025&lt;/year&gt;&lt;/dates&gt;&lt;urls&gt;&lt;related-urls&gt;&lt;url&gt;https://dx.doi.org/10.14744/GKDAD.2025.78790&lt;/url&gt;&lt;/related-urls&gt;&lt;/urls&gt;&lt;electronic-resource-num&gt;10.14744/gkdad.2025.78790&lt;/electronic-resource-num&gt;&lt;/record&gt;&lt;/Cite&gt;&lt;/EndNote&gt; </w:instrText>
       </w:r>
       <w:r>
         <w:rPr>
@@ -29252,7 +29090,7 @@
           <w:sz w:val="20"/>
           <w:szCs w:val="20"/>
         </w:rPr>
-        <w:instrText xml:space="preserve"> ADDIN EN.CITE &lt;EndNote&gt;&lt;Cite&gt;&lt;Author&gt;Piekarski&lt;/Author&gt;&lt;Year&gt;2024&lt;/Year&gt;&lt;RecNum&gt;24&lt;/RecNum&gt;&lt;DisplayText&gt;[19]&lt;/DisplayText&gt;&lt;record&gt;&lt;rec-number&gt;24&lt;/rec-number&gt;&lt;foreign-keys&gt;&lt;key app="EN" db-id="sspsadtz5rexd3efdx2xftzep5a0tszvrest" timestamp="1787939628"&gt;24&lt;/key&gt;&lt;/foreign-keys&gt;&lt;ref-type name="Journal Article"&gt;17&lt;/ref-type&gt;&lt;contributors&gt;&lt;authors&gt;&lt;author&gt;Piekarski, Florian&lt;/author&gt;&lt;author&gt;Rohner, Marc&lt;/author&gt;&lt;author&gt;Monsefi, Nadejda&lt;/author&gt;&lt;author&gt;Bakhtiary, Farhad&lt;/author&gt;&lt;author&gt;Velten, Markus&lt;/author&gt;&lt;/authors&gt;&lt;/contributors&gt;&lt;titles&gt;&lt;title&gt;Anesthesia for minimal invasive cardiac surgery: The Bonn heart center protocol&lt;/title&gt;&lt;secondary-title&gt;Journal of Clinical Medicine&lt;/secondary-title&gt;&lt;/titles&gt;&lt;periodical&gt;&lt;full-title&gt;Journal of Clinical Medicine&lt;/full-title&gt;&lt;/periodical&gt;&lt;pages&gt;3939&lt;/pages&gt;&lt;volume&gt;13&lt;/volume&gt;&lt;number&gt;13&lt;/number&gt;&lt;dates&gt;&lt;year&gt;2024&lt;/year&gt;&lt;/dates&gt;&lt;isbn&gt;2077-0383&lt;/isbn&gt;&lt;urls&gt;&lt;/urls&gt;&lt;/record&gt;&lt;/Cite&gt;&lt;/EndNote&gt;</w:instrText>
+        <w:instrText xml:space="preserve"> ADDIN EN.CITE &lt;EndNote&gt;&lt;Cite&gt;&lt;Author&gt;Piekarski&lt;/Author&gt;&lt;Year&gt;2024&lt;/Year&gt;&lt;RecNum&gt;24&lt;/RecNum&gt;&lt;DisplayText&gt;[22]&lt;/DisplayText&gt;&lt;record&gt;&lt;rec-number&gt;24&lt;/rec-number&gt;&lt;foreign-keys&gt;&lt;key app="EN" db-id="sspsadtz5rexd3efdx2xftzep5a0tszvrest" timestamp="1787939628"&gt;24&lt;/key&gt;&lt;/foreign-keys&gt;&lt;ref-type name="Journal Article"&gt;17&lt;/ref-type&gt;&lt;contributors&gt;&lt;authors&gt;&lt;author&gt;Piekarski, Florian&lt;/author&gt;&lt;author&gt;Rohner, Marc&lt;/author&gt;&lt;author&gt;Monsefi, Nadejda&lt;/author&gt;&lt;author&gt;Bakhtiary, Farhad&lt;/author&gt;&lt;author&gt;Velten, Markus&lt;/author&gt;&lt;/authors&gt;&lt;/contributors&gt;&lt;titles&gt;&lt;title&gt;Anesthesia for minimal invasive cardiac surgery: The Bonn heart center protocol&lt;/title&gt;&lt;secondary-title&gt;Journal of Clinical Medicine&lt;/secondary-title&gt;&lt;/titles&gt;&lt;periodical&gt;&lt;full-title&gt;Journal of Clinical Medicine&lt;/full-title&gt;&lt;/periodical&gt;&lt;pages&gt;3939&lt;/pages&gt;&lt;volume&gt;13&lt;/volume&gt;&lt;number&gt;13&lt;/number&gt;&lt;dates&gt;&lt;year&gt;2024&lt;/year&gt;&lt;/dates&gt;&lt;isbn&gt;2077-0383&lt;/isbn&gt;&lt;urls&gt;&lt;/urls&gt;&lt;/record&gt;&lt;/Cite&gt;&lt;/EndNote&gt; </w:instrText>
       </w:r>
       <w:r>
         <w:rPr>
@@ -31378,7 +31216,7 @@
           <w:sz w:val="20"/>
           <w:szCs w:val="20"/>
         </w:rPr>
-        <w:instrText xml:space="preserve"> ADDIN EN.CITE &lt;EndNote&gt;&lt;Cite&gt;&lt;Author&gt;Marianello&lt;/Author&gt;&lt;Year&gt;2025&lt;/Year&gt;&lt;RecNum&gt;25&lt;/RecNum&gt;&lt;DisplayText&gt;[20]&lt;/DisplayText&gt;&lt;record&gt;&lt;rec-number&gt;25&lt;/rec-number&gt;&lt;foreign-keys&gt;&lt;key app="EN" db-id="sspsadtz5rexd3efdx2xftzep5a0tszvrest" timestamp="1787939737"&gt;25&lt;/key&gt;&lt;/foreign-keys&gt;&lt;ref-type name="Journal Article"&gt;17&lt;/ref-type&gt;&lt;contributors&gt;&lt;authors&gt;&lt;author&gt;Marianello, Daniele&lt;/author&gt;&lt;author&gt;Biuzzi, Cesare&lt;/author&gt;&lt;author&gt;Sanfilippo, Filippo&lt;/author&gt;&lt;author&gt;Marcucci, Riccardo&lt;/author&gt;&lt;author&gt;Ginetti, Francesco&lt;/author&gt;&lt;author&gt;Cartocci, Alessandra&lt;/author&gt;&lt;author&gt;Milani, Matilde&lt;/author&gt;&lt;author&gt;De Matteis, Francesco Lorenzo&lt;/author&gt;&lt;author&gt;Puddu, Antonella&lt;/author&gt;&lt;author&gt;Rizzo, Martina&lt;/author&gt;&lt;/authors&gt;&lt;/contributors&gt;&lt;titles&gt;&lt;title&gt;Deep serratus anterior plane block for multimodal analgesia in minimally invasive mitral valve surgery performed via right anterior mini-thoracotomy&lt;/title&gt;&lt;secondary-title&gt;Journal of Cardiothoracic and Vascular Anesthesia&lt;/secondary-title&gt;&lt;/titles&gt;&lt;periodical&gt;&lt;full-title&gt;Journal of Cardiothoracic and Vascular Anesthesia&lt;/full-title&gt;&lt;/periodical&gt;&lt;pages&gt;941-948&lt;/pages&gt;&lt;volume&gt;39&lt;/volume&gt;&lt;number&gt;4&lt;/number&gt;&lt;dates&gt;&lt;year&gt;2025&lt;/year&gt;&lt;/dates&gt;&lt;isbn&gt;1053-0770&lt;/isbn&gt;&lt;urls&gt;&lt;/urls&gt;&lt;/record&gt;&lt;/Cite&gt;&lt;/EndNote&gt;</w:instrText>
+        <w:instrText xml:space="preserve"> ADDIN EN.CITE &lt;EndNote&gt;&lt;Cite&gt;&lt;Author&gt;Marianello&lt;/Author&gt;&lt;Year&gt;2025&lt;/Year&gt;&lt;RecNum&gt;25&lt;/RecNum&gt;&lt;DisplayText&gt;[23]&lt;/DisplayText&gt;&lt;record&gt;&lt;rec-number&gt;25&lt;/rec-number&gt;&lt;foreign-keys&gt;&lt;key app="EN" db-id="sspsadtz5rexd3efdx2xftzep5a0tszvrest" timestamp="1787939737"&gt;25&lt;/key&gt;&lt;/foreign-keys&gt;&lt;ref-type name="Journal Article"&gt;17&lt;/ref-type&gt;&lt;contributors&gt;&lt;authors&gt;&lt;author&gt;Marianello, Daniele&lt;/author&gt;&lt;author&gt;Biuzzi, Cesare&lt;/author&gt;&lt;author&gt;Sanfilippo, Filippo&lt;/author&gt;&lt;author&gt;Marcucci, Riccardo&lt;/author&gt;&lt;author&gt;Ginetti, Francesco&lt;/author&gt;&lt;author&gt;Cartocci, Alessandra&lt;/author&gt;&lt;author&gt;Milani, Matilde&lt;/author&gt;&lt;author&gt;De Matteis, Francesco Lorenzo&lt;/author&gt;&lt;author&gt;Puddu, Antonella&lt;/author&gt;&lt;author&gt;Rizzo, Martina&lt;/author&gt;&lt;/authors&gt;&lt;/contributors&gt;&lt;titles&gt;&lt;title&gt;Deep serratus anterior plane block for multimodal analgesia in minimally invasive mitral valve surgery performed via right anterior mini-thoracotomy&lt;/title&gt;&lt;secondary-title&gt;Journal of Cardiothoracic and Vascular Anesthesia&lt;/secondary-title&gt;&lt;/titles&gt;&lt;periodical&gt;&lt;full-title&gt;Journal of Cardiothoracic and Vascular Anesthesia&lt;/full-title&gt;&lt;/periodical&gt;&lt;pages&gt;941-948&lt;/pages&gt;&lt;volume&gt;39&lt;/volume&gt;&lt;number&gt;4&lt;/number&gt;&lt;dates&gt;&lt;year&gt;2025&lt;/year&gt;&lt;/dates&gt;&lt;isbn&gt;1053-0770&lt;/isbn&gt;&lt;urls&gt;&lt;/urls&gt;&lt;/record&gt;&lt;/Cite&gt;&lt;/EndNote&gt; </w:instrText>
       </w:r>
       <w:r>
         <w:rPr>
@@ -31934,7 +31772,7 @@
           <w:sz w:val="20"/>
           <w:szCs w:val="20"/>
         </w:rPr>
-        <w:instrText xml:space="preserve"> ADDIN EN.CITE &lt;EndNote&gt;&lt;Cite&gt;&lt;Author&gt;Jiang&lt;/Author&gt;&lt;Year&gt;2025&lt;/Year&gt;&lt;RecNum&gt;26&lt;/RecNum&gt;&lt;DisplayText&gt;[21]&lt;/DisplayText&gt;&lt;record&gt;&lt;rec-number&gt;26&lt;/rec-number&gt;&lt;foreign-keys&gt;&lt;key app="EN" db-id="sspsadtz5rexd3efdx2xftzep5a0tszvrest" timestamp="1787939892"&gt;26&lt;/key&gt;&lt;/foreign-keys&gt;&lt;ref-type name="Journal Article"&gt;17&lt;/ref-type&gt;&lt;contributors&gt;&lt;authors&gt;&lt;author&gt;Jiang, Tian&lt;/author&gt;&lt;author&gt;Xu, Linting&lt;/author&gt;&lt;author&gt;Zheng, Qinghui&lt;/author&gt;&lt;author&gt;Zhang, Yihui&lt;/author&gt;&lt;author&gt;Wang, Shuaibing&lt;/author&gt;&lt;author&gt;Wang, Yu&lt;/author&gt;&lt;author&gt;Lou, Xiaokan&lt;/author&gt;&lt;author&gt;Yan, Meijuan&lt;/author&gt;&lt;author&gt;Wei, Hanwei&lt;/author&gt;&lt;/authors&gt;&lt;/contributors&gt;&lt;titles&gt;&lt;title&gt;Implementing Ultra–Fast-Track Cardiac Anesthesia in Minimally Invasive Cardiac Surgery&lt;/title&gt;&lt;secondary-title&gt;Journal of Cardiothoracic and Vascular Anesthesia&lt;/secondary-title&gt;&lt;/titles&gt;&lt;periodical&gt;&lt;full-title&gt;Journal of Cardiothoracic and Vascular Anesthesia&lt;/full-title&gt;&lt;/periodical&gt;&lt;pages&gt;2031-2039&lt;/pages&gt;&lt;volume&gt;39&lt;/volume&gt;&lt;number&gt;8&lt;/number&gt;&lt;dates&gt;&lt;year&gt;2025&lt;/year&gt;&lt;/dates&gt;&lt;isbn&gt;1053-0770&lt;/isbn&gt;&lt;urls&gt;&lt;/urls&gt;&lt;/record&gt;&lt;/Cite&gt;&lt;/EndNote&gt;</w:instrText>
+        <w:instrText xml:space="preserve"> ADDIN EN.CITE &lt;EndNote&gt;&lt;Cite&gt;&lt;Author&gt;Jiang&lt;/Author&gt;&lt;Year&gt;2025&lt;/Year&gt;&lt;RecNum&gt;26&lt;/RecNum&gt;&lt;DisplayText&gt;[24]&lt;/DisplayText&gt;&lt;record&gt;&lt;rec-number&gt;26&lt;/rec-number&gt;&lt;foreign-keys&gt;&lt;key app="EN" db-id="sspsadtz5rexd3efdx2xftzep5a0tszvrest" timestamp="1787939892"&gt;26&lt;/key&gt;&lt;/foreign-keys&gt;&lt;ref-type name="Journal Article"&gt;17&lt;/ref-type&gt;&lt;contributors&gt;&lt;authors&gt;&lt;author&gt;Jiang, Tian&lt;/author&gt;&lt;author&gt;Xu, Linting&lt;/author&gt;&lt;author&gt;Zheng, Qinghui&lt;/author&gt;&lt;author&gt;Zhang, Yihui&lt;/author&gt;&lt;author&gt;Wang, Shuaibing&lt;/author&gt;&lt;author&gt;Wang, Yu&lt;/author&gt;&lt;author&gt;Lou, Xiaokan&lt;/author&gt;&lt;author&gt;Yan, Meijuan&lt;/author&gt;&lt;author&gt;Wei, Hanwei&lt;/author&gt;&lt;/authors&gt;&lt;/contributors&gt;&lt;titles&gt;&lt;title&gt;Implementing Ultra–Fast-Track Cardiac Anesthesia in Minimally Invasive Cardiac Surgery&lt;/title&gt;&lt;secondary-title&gt;Journal of Cardiothoracic and Vascular Anesthesia&lt;/secondary-title&gt;&lt;/titles&gt;&lt;periodical&gt;&lt;full-title&gt;Journal of Cardiothoracic and Vascular Anesthesia&lt;/full-title&gt;&lt;/periodical&gt;&lt;pages&gt;2031-2039&lt;/pages&gt;&lt;volume&gt;39&lt;/volume&gt;&lt;number&gt;8&lt;/number&gt;&lt;dates&gt;&lt;year&gt;2025&lt;/year&gt;&lt;/dates&gt;&lt;isbn&gt;1053-0770&lt;/isbn&gt;&lt;urls&gt;&lt;/urls&gt;&lt;/record&gt;&lt;/Cite&gt;&lt;/EndNote&gt; </w:instrText>
       </w:r>
       <w:r>
         <w:rPr>
@@ -32250,7 +32088,7 @@
           <w:sz w:val="20"/>
           <w:szCs w:val="20"/>
         </w:rPr>
-        <w:instrText xml:space="preserve"> ADDIN EN.CITE &lt;EndNote&gt;&lt;Cite&gt;&lt;Author&gt;Wang&lt;/Author&gt;&lt;Year&gt;2024&lt;/Year&gt;&lt;RecNum&gt;27&lt;/RecNum&gt;&lt;DisplayText&gt;[22]&lt;/DisplayText&gt;&lt;record&gt;&lt;rec-number&gt;27&lt;/rec-number&gt;&lt;foreign-keys&gt;&lt;key app="EN" db-id="sspsadtz5rexd3efdx2xftzep5a0tszvrest" timestamp="1787939977"&gt;27&lt;/key&gt;&lt;/foreign-keys&gt;&lt;ref-type name="Journal Article"&gt;17&lt;/ref-type&gt;&lt;contributors&gt;&lt;authors&gt;&lt;author&gt;Wang, Chen Chia&lt;/author&gt;&lt;author&gt;DeBose-Scarlett, Alexandra&lt;/author&gt;&lt;author&gt;Irlmeier, Rebecca&lt;/author&gt;&lt;author&gt;Ye, Fei&lt;/author&gt;&lt;author&gt;Siegrist, Kara&lt;/author&gt;&lt;author&gt;Shah, Ashish S&lt;/author&gt;&lt;author&gt;Kingeter, Meredith&lt;/author&gt;&lt;/authors&gt;&lt;/contributors&gt;&lt;titles&gt;&lt;title&gt;Safe landing: Feasibility and safety of operating room extubation in minimally invasive cardiac valve surgery&lt;/title&gt;&lt;secondary-title&gt;Journal of Cardiothoracic and Vascular Anesthesia&lt;/secondary-title&gt;&lt;/titles&gt;&lt;periodical&gt;&lt;full-title&gt;Journal of Cardiothoracic and Vascular Anesthesia&lt;/full-title&gt;&lt;/periodical&gt;&lt;pages&gt;2965-2972&lt;/pages&gt;&lt;volume&gt;38&lt;/volume&gt;&lt;number&gt;12&lt;/number&gt;&lt;dates&gt;&lt;year&gt;2024&lt;/year&gt;&lt;/dates&gt;&lt;isbn&gt;1053-0770&lt;/isbn&gt;&lt;urls&gt;&lt;/urls&gt;&lt;/record&gt;&lt;/Cite&gt;&lt;/EndNote&gt;</w:instrText>
+        <w:instrText xml:space="preserve"> ADDIN EN.CITE &lt;EndNote&gt;&lt;Cite&gt;&lt;Author&gt;Wang&lt;/Author&gt;&lt;Year&gt;2024&lt;/Year&gt;&lt;RecNum&gt;27&lt;/RecNum&gt;&lt;DisplayText&gt;[25]&lt;/DisplayText&gt;&lt;record&gt;&lt;rec-number&gt;27&lt;/rec-number&gt;&lt;foreign-keys&gt;&lt;key app="EN" db-id="sspsadtz5rexd3efdx2xftzep5a0tszvrest" timestamp="1787939977"&gt;27&lt;/key&gt;&lt;/foreign-keys&gt;&lt;ref-type name="Journal Article"&gt;17&lt;/ref-type&gt;&lt;contributors&gt;&lt;authors&gt;&lt;author&gt;Wang, Chen Chia&lt;/author&gt;&lt;author&gt;DeBose-Scarlett, Alexandra&lt;/author&gt;&lt;author&gt;Irlmeier, Rebecca&lt;/author&gt;&lt;author&gt;Ye, Fei&lt;/author&gt;&lt;author&gt;Siegrist, Kara&lt;/author&gt;&lt;author&gt;Shah, Ashish S&lt;/author&gt;&lt;author&gt;Kingeter, Meredith&lt;/author&gt;&lt;/authors&gt;&lt;/contributors&gt;&lt;titles&gt;&lt;title&gt;Safe landing: Feasibility and safety of operating room extubation in minimally invasive cardiac valve surgery&lt;/title&gt;&lt;secondary-title&gt;Journal of Cardiothoracic and Vascular Anesthesia&lt;/secondary-title&gt;&lt;/titles&gt;&lt;periodical&gt;&lt;full-title&gt;Journal of Cardiothoracic and Vascular Anesthesia&lt;/full-title&gt;&lt;/periodical&gt;&lt;pages&gt;2965-2972&lt;/pages&gt;&lt;volume&gt;38&lt;/volume&gt;&lt;number&gt;12&lt;/number&gt;&lt;dates&gt;&lt;year&gt;2024&lt;/year&gt;&lt;/dates&gt;&lt;isbn&gt;1053-0770&lt;/isbn&gt;&lt;urls&gt;&lt;/urls&gt;&lt;/record&gt;&lt;/Cite&gt;&lt;/EndNote&gt; </w:instrText>
       </w:r>
       <w:r>
         <w:rPr>
@@ -33810,7 +33648,7 @@
           <w:sz w:val="20"/>
           <w:szCs w:val="20"/>
         </w:rPr>
-        <w:instrText xml:space="preserve"> ADDIN EN.CITE &lt;EndNote&gt;&lt;Cite&gt;&lt;Author&gt;Rosengart&lt;/Author&gt;&lt;Year&gt;2008&lt;/Year&gt;&lt;RecNum&gt;28&lt;/RecNum&gt;&lt;DisplayText&gt;[23]&lt;/DisplayText&gt;&lt;record&gt;&lt;rec-number&gt;28&lt;/rec-number&gt;&lt;foreign-keys&gt;&lt;key app="EN" db-id="sspsadtz5rexd3efdx2xftzep5a0tszvrest" timestamp="1787940044"&gt;28&lt;/key&gt;&lt;/foreign-keys&gt;&lt;ref-type name="Journal Article"&gt;17&lt;/ref-type&gt;&lt;contributors&gt;&lt;authors&gt;&lt;author&gt;Rosengart, Todd K&lt;/author&gt;&lt;author&gt;Feldman, Ted&lt;/author&gt;&lt;author&gt;Borger, Michael A&lt;/author&gt;&lt;author&gt;Vassiliades Jr, Thomas A&lt;/author&gt;&lt;author&gt;Gillinov, A Marc&lt;/author&gt;&lt;author&gt;Hoercher, Katherine J&lt;/author&gt;&lt;author&gt;Vahanian, Alec&lt;/author&gt;&lt;author&gt;Bonow, Robert O&lt;/author&gt;&lt;author&gt;O’Neill, William&lt;/author&gt;&lt;/authors&gt;&lt;/contributors&gt;&lt;titles&gt;&lt;title&gt;Percutaneous and minimally invasive valve procedures: a scientific statement from the American Heart Association Council on cardiovascular surgery and anesthesia, council on clinical cardiology, functional genomics and translational biology interdisciplinary working group, and quality of care and outcomes research interdisciplinary working group&lt;/title&gt;&lt;secondary-title&gt;Circulation&lt;/secondary-title&gt;&lt;/titles&gt;&lt;periodical&gt;&lt;full-title&gt;Circulation&lt;/full-title&gt;&lt;/periodical&gt;&lt;pages&gt;1750-1767&lt;/pages&gt;&lt;volume&gt;117&lt;/volume&gt;&lt;number&gt;13&lt;/number&gt;&lt;dates&gt;&lt;year&gt;2008&lt;/year&gt;&lt;/dates&gt;&lt;isbn&gt;0009-7322&lt;/isbn&gt;&lt;urls&gt;&lt;/urls&gt;&lt;/record&gt;&lt;/Cite&gt;&lt;/EndNote&gt;</w:instrText>
+        <w:instrText xml:space="preserve"> ADDIN EN.CITE &lt;EndNote&gt;&lt;Cite&gt;&lt;Author&gt;Rosengart&lt;/Author&gt;&lt;Year&gt;2008&lt;/Year&gt;&lt;RecNum&gt;28&lt;/RecNum&gt;&lt;DisplayText&gt;[26]&lt;/DisplayText&gt;&lt;record&gt;&lt;rec-number&gt;28&lt;/rec-number&gt;&lt;foreign-keys&gt;&lt;key app="EN" db-id="sspsadtz5rexd3efdx2xftzep5a0tszvrest" timestamp="1787940044"&gt;28&lt;/key&gt;&lt;/foreign-keys&gt;&lt;ref-type name="Journal Article"&gt;17&lt;/ref-type&gt;&lt;contributors&gt;&lt;authors&gt;&lt;author&gt;Rosengart, Todd K&lt;/author&gt;&lt;author&gt;Feldman, Ted&lt;/author&gt;&lt;author&gt;Borger, Michael A&lt;/author&gt;&lt;author&gt;Vassiliades Jr, Thomas A&lt;/author&gt;&lt;author&gt;Gillinov, A Marc&lt;/author&gt;&lt;author&gt;Hoercher, Katherine J&lt;/author&gt;&lt;author&gt;Vahanian, Alec&lt;/author&gt;&lt;author&gt;Bonow, Robert O&lt;/author&gt;&lt;author&gt;O’Neill, William&lt;/author&gt;&lt;/authors&gt;&lt;/contributors&gt;&lt;titles&gt;&lt;title&gt;Percutaneous and minimally invasive valve procedures: a scientific statement from the American Heart Association Council on cardiovascular surgery and anesthesia, council on clinical cardiology, functional genomics and translational biology interdisciplinary working group, and quality of care and outcomes research interdisciplinary working group&lt;/title&gt;&lt;secondary-title&gt;Circulation&lt;/secondary-title&gt;&lt;/titles&gt;&lt;periodical&gt;&lt;full-title&gt;Circulation&lt;/full-title&gt;&lt;/periodical&gt;&lt;pages&gt;1750-1767&lt;/pages&gt;&lt;volume&gt;117&lt;/volume&gt;&lt;number&gt;13&lt;/number&gt;&lt;dates&gt;&lt;year&gt;2008&lt;/year&gt;&lt;/dates&gt;&lt;isbn&gt;0009-7322&lt;/isbn&gt;&lt;urls&gt;&lt;/urls&gt;&lt;/record&gt;&lt;/Cite&gt;&lt;/EndNote&gt; </w:instrText>
       </w:r>
       <w:r>
         <w:rPr>
@@ -34266,7 +34104,7 @@
           <w:sz w:val="20"/>
           <w:szCs w:val="20"/>
         </w:rPr>
-        <w:instrText xml:space="preserve"> ADDIN EN.CITE &lt;EndNote&gt;&lt;Cite&gt;&lt;Author&gt;Altawil&lt;/Author&gt;&lt;Year&gt;2025&lt;/Year&gt;&lt;RecNum&gt;29&lt;/RecNum&gt;&lt;DisplayText&gt;[24]&lt;/DisplayText&gt;&lt;record&gt;&lt;rec-number&gt;29&lt;/rec-number&gt;&lt;foreign-keys&gt;&lt;key app="EN" db-id="sspsadtz5rexd3efdx2xftzep5a0tszvrest" timestamp="1787940110"&gt;29&lt;/key&gt;&lt;/foreign-keys&gt;&lt;ref-type name="Journal Article"&gt;17&lt;/ref-type&gt;&lt;contributors&gt;&lt;authors&gt;&lt;author&gt;Altawil, Laith&lt;/author&gt;&lt;author&gt;Dayeh, Mohammad&lt;/author&gt;&lt;author&gt;Hammoudeh, Suhail&lt;/author&gt;&lt;author&gt;Jaber, Naser&lt;/author&gt;&lt;author&gt;Dayeh, Abdul-Hakim&lt;/author&gt;&lt;author&gt;Dayyeh, Mohammad&lt;/author&gt;&lt;/authors&gt;&lt;/contributors&gt;&lt;titles&gt;&lt;title&gt;Minimally Invasive Mitral Valve Replacement in a Patient With a Giant Left Atrium&lt;/title&gt;&lt;secondary-title&gt;Cureus&lt;/secondary-title&gt;&lt;/titles&gt;&lt;periodical&gt;&lt;full-title&gt;Cureus&lt;/full-title&gt;&lt;/periodical&gt;&lt;volume&gt;17&lt;/volume&gt;&lt;number&gt;6&lt;/number&gt;&lt;dates&gt;&lt;year&gt;2025&lt;/year&gt;&lt;/dates&gt;&lt;isbn&gt;2168-8184&lt;/isbn&gt;&lt;urls&gt;&lt;/urls&gt;&lt;/record&gt;&lt;/Cite&gt;&lt;/EndNote&gt;</w:instrText>
+        <w:instrText xml:space="preserve"> ADDIN EN.CITE &lt;EndNote&gt;&lt;Cite&gt;&lt;Author&gt;Altawil&lt;/Author&gt;&lt;Year&gt;2025&lt;/Year&gt;&lt;RecNum&gt;29&lt;/RecNum&gt;&lt;DisplayText&gt;[27]&lt;/DisplayText&gt;&lt;record&gt;&lt;rec-number&gt;29&lt;/rec-number&gt;&lt;foreign-keys&gt;&lt;key app="EN" db-id="sspsadtz5rexd3efdx2xftzep5a0tszvrest" timestamp="1787940110"&gt;29&lt;/key&gt;&lt;/foreign-keys&gt;&lt;ref-type name="Journal Article"&gt;17&lt;/ref-type&gt;&lt;contributors&gt;&lt;authors&gt;&lt;author&gt;Altawil, Laith&lt;/author&gt;&lt;author&gt;Dayeh, Mohammad&lt;/author&gt;&lt;author&gt;Hammoudeh, Suhail&lt;/author&gt;&lt;author&gt;Jaber, Naser&lt;/author&gt;&lt;author&gt;Dayeh, Abdul-Hakim&lt;/author&gt;&lt;author&gt;Dayyeh, Mohammad&lt;/author&gt;&lt;/authors&gt;&lt;/contributors&gt;&lt;titles&gt;&lt;title&gt;Minimally Invasive Mitral Valve Replacement in a Patient With a Giant Left Atrium&lt;/title&gt;&lt;secondary-title&gt;Cureus&lt;/secondary-title&gt;&lt;/titles&gt;&lt;periodical&gt;&lt;full-title&gt;Cureus&lt;/full-title&gt;&lt;/periodical&gt;&lt;volume&gt;17&lt;/volume&gt;&lt;number&gt;6&lt;/number&gt;&lt;dates&gt;&lt;year&gt;2025&lt;/year&gt;&lt;/dates&gt;&lt;isbn&gt;2168-8184&lt;/isbn&gt;&lt;urls&gt;&lt;/urls&gt;&lt;/record&gt;&lt;/Cite&gt;&lt;/EndNote&gt; </w:instrText>
       </w:r>
       <w:r>
         <w:rPr>
@@ -34542,7 +34380,7 @@
           <w:sz w:val="20"/>
           <w:szCs w:val="20"/>
         </w:rPr>
-        <w:instrText xml:space="preserve"> ADDIN EN.CITE &lt;EndNote&gt;&lt;Cite&gt;&lt;Author&gt;Parnell&lt;/Author&gt;&lt;Year&gt;2018&lt;/Year&gt;&lt;RecNum&gt;30&lt;/RecNum&gt;&lt;DisplayText&gt;[25]&lt;/DisplayText&gt;&lt;record&gt;&lt;rec-number&gt;30&lt;/rec-number&gt;&lt;foreign-keys&gt;&lt;key app="EN" db-id="sspsadtz5rexd3efdx2xftzep5a0tszvrest" timestamp="1787940165"&gt;30&lt;/key&gt;&lt;/foreign-keys&gt;&lt;ref-type name="Journal Article"&gt;17&lt;/ref-type&gt;&lt;contributors&gt;&lt;authors&gt;&lt;author&gt;Parnell, A&lt;/author&gt;&lt;author&gt;Prince, M&lt;/author&gt;&lt;/authors&gt;&lt;/contributors&gt;&lt;titles&gt;&lt;title&gt;Anaesthesia for minimally invasive cardiac surgery&lt;/title&gt;&lt;secondary-title&gt;BJA education&lt;/secondary-title&gt;&lt;/titles&gt;&lt;periodical&gt;&lt;full-title&gt;BJA education&lt;/full-title&gt;&lt;/periodical&gt;&lt;pages&gt;323-330&lt;/pages&gt;&lt;volume&gt;18&lt;/volume&gt;&lt;number&gt;10&lt;/number&gt;&lt;dates&gt;&lt;year&gt;2018&lt;/year&gt;&lt;/dates&gt;&lt;isbn&gt;2058-5349&lt;/isbn&gt;&lt;urls&gt;&lt;/urls&gt;&lt;/record&gt;&lt;/Cite&gt;&lt;/EndNote&gt;</w:instrText>
+        <w:instrText xml:space="preserve"> ADDIN EN.CITE &lt;EndNote&gt;&lt;Cite&gt;&lt;Author&gt;Parnell&lt;/Author&gt;&lt;Year&gt;2018&lt;/Year&gt;&lt;RecNum&gt;30&lt;/RecNum&gt;&lt;DisplayText&gt;[28]&lt;/DisplayText&gt;&lt;record&gt;&lt;rec-number&gt;30&lt;/rec-number&gt;&lt;foreign-keys&gt;&lt;key app="EN" db-id="sspsadtz5rexd3efdx2xftzep5a0tszvrest" timestamp="1787940165"&gt;30&lt;/key&gt;&lt;/foreign-keys&gt;&lt;ref-type name="Journal Article"&gt;17&lt;/ref-type&gt;&lt;contributors&gt;&lt;authors&gt;&lt;author&gt;Parnell, A&lt;/author&gt;&lt;author&gt;Prince, M&lt;/author&gt;&lt;/authors&gt;&lt;/contributors&gt;&lt;titles&gt;&lt;title&gt;Anaesthesia for minimally invasive cardiac surgery&lt;/title&gt;&lt;secondary-title&gt;BJA education&lt;/secondary-title&gt;&lt;/titles&gt;&lt;periodical&gt;&lt;full-title&gt;BJA education&lt;/full-title&gt;&lt;/periodical&gt;&lt;pages&gt;323-330&lt;/pages&gt;&lt;volume&gt;18&lt;/volume&gt;&lt;number&gt;10&lt;/number&gt;&lt;dates&gt;&lt;year&gt;2018&lt;/year&gt;&lt;/dates&gt;&lt;isbn&gt;2058-5349&lt;/isbn&gt;&lt;urls&gt;&lt;/urls&gt;&lt;/record&gt;&lt;/Cite&gt;&lt;/EndNote&gt; </w:instrText>
       </w:r>
       <w:r>
         <w:rPr>

</xml_diff>